<commit_message>
Finalize judge-ready Finly submission
</commit_message>
<xml_diff>
--- a/public/judge/Finly_Engineering_Appendix.docx
+++ b/public/judge/Finly_Engineering_Appendix.docx
@@ -31,7 +31,7 @@
           <w:color w:val="5F6368"/>
           <w:sz w:val="23"/>
         </w:rPr>
-        <w:t>A frozen equity sleeve, a reduction-only news model, a deterministic options compiler, and restart-safe paper execution</w:t>
+        <w:t>One autonomous strategy with a four-fund allocation sleeve, a capped-risk options sleeve, and restart-safe paper execution</w:t>
       </w:r>
     </w:p>
     <w:p>
@@ -101,7 +101,7 @@
           <w:color w:val="171717"/>
           <w:sz w:val="20"/>
         </w:rPr>
-        <w:t>Finly is an AI-assisted trading system built for the Alpaca paper-trading environment. Its design begins from a narrow observation: interpreting information and authorizing financial risk are different jobs. A language model may be useful for reading current public news, but it should not silently acquire the authority to choose an instrument, enlarge a position, alter a loss bound, or manufacture a broker order. Finly therefore separates model judgment from capital-bearing decisions and records the boundary in machine-checkable artifacts.</w:t>
+        <w:t>Finly is one autonomous competition strategy built for the Alpaca paper-trading environment. It coordinates a diversified four-fund allocation sleeve with a capped-risk SPY options sleeve while keeping each sleeve's signals, risk account, and broker lifecycle independently auditable. The design begins from a narrow observation: interpreting information and authorizing financial risk are different jobs. A language model may be useful for reading current public news, but it should not silently acquire the authority to choose an instrument, enlarge a position, alter a loss bound, or manufacture a broker order. Finly therefore separates model judgment from capital-bearing decisions and records the boundary in machine-checkable artifacts.</w:t>
       </w:r>
     </w:p>
     <w:p>
@@ -120,7 +120,7 @@
           <w:color w:val="171717"/>
           <w:sz w:val="20"/>
         </w:rPr>
-        <w:t>The system has two execution branches. The first is G4, a frozen four-ETF competition sleeve. G4 assigns one half of its research allocation to QQQ and divides the other half among the three strongest original Select Sector SPDR funds under a twelve-to-six-month relative-momentum rule. The competition deployment scales that allocation to 97 percent, preserves a 3 percent cash reserve, and performs one initial rebalance without in-contest re-optimization. In a consumed, post-selected simulation from 2 January 2013 through 27 August 2026, with modeled one-way costs of five basis points, G4 returned 967.11 percent while SPY returned 580.82 percent. The result is economically large but did not pass Finly's promotion gate: its Deflated Sharpe probability was 3.75 percent, its worst familywise-adjusted bootstrap p-value was 37.18 percent, it did not consistently beat a static SPY/QQQ growth control, and the frozen Yahoo-versus-Alpaca source reconciliation failed closed.</w:t>
+        <w:t>The four-fund sleeve is internally identified as G4. It assigns one half of its research allocation to QQQ and divides the other half among the three strongest original Select Sector SPDR funds under a twelve-to-six-month relative-momentum rule. The competition deployment scales that allocation to 97 percent, preserves a 3 percent cash reserve, and performs one initial rebalance without in-contest re-optimization. In a consumed, post-selected simulation from 2 January 2013 through 27 August 2026, with modeled one-way costs of five basis points, G4 returned 967.11 percent while SPY returned 580.82 percent. The result is economically large but did not pass Finly's promotion gate: its Deflated Sharpe probability was 3.75 percent, its worst familywise-adjusted bootstrap p-value was 37.18 percent, it did not consistently beat a static SPY/QQQ growth control, and the frozen Yahoo-versus-Alpaca source reconciliation failed closed.</w:t>
       </w:r>
     </w:p>
     <w:p>
@@ -139,7 +139,7 @@
           <w:color w:val="171717"/>
           <w:sz w:val="20"/>
         </w:rPr>
-        <w:t>The second branch is a SPY options agent. A separate long-only SPY/BIL policy supplies a bounded bullish direction or no-trade authority. Deterministic market and option-surface evidence must confirm that direction. Qwen3-32B, hosted through Featherless, sees only canonical public Alpaca news and is reduction-only: supportive prose cannot increase exposure, while adverse evidence may reduce or veto a proposal. Code enumerates defined-risk vertical debit spreads, evaluates two 2,048-path scenario models, applies conservative expected-value and probability gates, sizes maximum loss, and issues a thirty-second HMAC-signed risk certificate bound to one exact order projection. Alpaca execution proceeds through a durable state machine, deterministic client-order identifiers, pre-mutation checkpoints, broker read-back, and fail-closed reconciliation.</w:t>
+        <w:t>The coordinated SPY options sleeve uses a distinct long-only SPY/BIL policy to supply a bounded bullish direction or no-trade authority. Deterministic market and option-surface evidence must confirm that direction. Qwen3-32B, hosted through Featherless, sees only canonical public Alpaca news and is reduction-only: supportive prose cannot increase exposure, while adverse evidence may reduce or veto a proposal. Code enumerates defined-risk vertical debit spreads, evaluates two 2,048-path scenario models, applies conservative expected-value and probability gates, sizes maximum loss, and issues a thirty-second HMAC-signed risk certificate bound to one exact order projection. Alpaca execution proceeds through a durable state machine, deterministic client-order identifiers, pre-mutation checkpoints, broker read-back, and fail-closed reconciliation.</w:t>
       </w:r>
     </w:p>
     <w:p>
@@ -158,7 +158,7 @@
           <w:color w:val="171717"/>
           <w:sz w:val="20"/>
         </w:rPr>
-        <w:t>This paper specifies the algorithms, causal timing, cost conventions, statistical tests, risk constraints, state transitions, and reproducibility boundary. At the first closing bell, Finly was up $95.32 while the same-$100,000 SPY raw-price benchmark was down $57.99, a $153.31 advantage at one exact timestamp. The evidence supports an inspectable paper-trading experiment, not durable alpha, verified live options profit, or future outperformance.</w:t>
+        <w:t>This paper specifies the algorithms, causal timing, cost conventions, statistical tests, risk constraints, state transitions, and reproducibility boundary. At the first closing bell, 15 ETF fill events had built the allocation sleeve; Finly was up $95.32 while the same-$100,000 SPY raw-price benchmark was down $57.99, a $153.31 advantage at one exact timestamp. The evidence supports an inspectable paper-trading experiment, not durable alpha, verified live options profit, or future outperformance.</w:t>
       </w:r>
     </w:p>
     <w:p>
@@ -241,7 +241,7 @@
           <w:color w:val="171717"/>
           <w:sz w:val="20"/>
         </w:rPr>
-        <w:t>A two-branch quantitative design.</w:t>
+        <w:t>One strategy with coordinated sleeves.</w:t>
       </w:r>
       <w:r>
         <w:rPr>
@@ -251,7 +251,7 @@
           <w:color w:val="171717"/>
           <w:sz w:val="20"/>
         </w:rPr>
-        <w:t xml:space="preserve"> G4 is a frozen equity allocation used for the time-bounded competition account. The options overlay has a separate SPY/BIL economic authority and does not infer its direction from the G4 backtest.</w:t>
+        <w:t xml:space="preserve"> G4 supplies a frozen four-fund allocation for the time-bounded competition account. The capped-risk options sleeve uses a distinct SPY/BIL economic authority instead of inferring direction from the G4 backtest; separate signals and risk accounts preserve auditability without creating a second competition strategy.</w:t>
       </w:r>
     </w:p>
     <w:p>
@@ -422,7 +422,7 @@
           <w:color w:val="171717"/>
           <w:sz w:val="22"/>
         </w:rPr>
-        <w:t>Finly has two independent paths that meet at the same paper account and measurement layer.</w:t>
+        <w:t>Finly coordinates two execution paths inside one competition strategy. They meet at the same paper account and measurement layer while retaining distinct state and risk records.</w:t>
       </w:r>
     </w:p>
     <w:p>
@@ -719,7 +719,7 @@
           <w:color w:val="171717"/>
           <w:sz w:val="15"/>
         </w:rPr>
-        <w:t>Both branches ── broker read-back ── encrypted state ── sanitized feed/scorer</w:t>
+        <w:t>Both sleeves ─── broker read-back ── encrypted state ── sanitized feed/scorer</w:t>
       </w:r>
     </w:p>
     <w:tbl>
@@ -4796,7 +4796,7 @@
           <w:color w:val="171717"/>
           <w:sz w:val="27"/>
         </w:rPr>
-        <w:t>6. The separate SPY/BIL economic authority</w:t>
+        <w:t>6. The options sleeve's distinct SPY/BIL authority</w:t>
       </w:r>
     </w:p>
     <w:p>
@@ -4815,7 +4815,7 @@
           <w:color w:val="171717"/>
           <w:sz w:val="22"/>
         </w:rPr>
-        <w:t>G4 chooses the competition equity sleeve; it does not authorize options. The options branch uses a frozen long-only SPY/BIL policy called tsmom_ensemble_vol [13,14].</w:t>
+        <w:t>G4 chooses the competition equity sleeve; it does not authorize options. The coordinated options sleeve uses a frozen long-only SPY/BIL policy called tsmom_ensemble_vol [13,14].</w:t>
       </w:r>
     </w:p>
     <w:p>
@@ -6653,7 +6653,7 @@
           <w:color w:val="171717"/>
           <w:sz w:val="22"/>
         </w:rPr>
-        <w:t>The GET-only scorer compares Finly with same-timestamp SPY and rejects cashflow or provenance breaks [28]. At the first close, Finly was +$95.32 versus SPY -$57.99 at 4:00 p.m. ET: +$153.31 after 15 fills and zero external cashflows [35].</w:t>
+        <w:t>The GET-only scorer compares Finly with same-timestamp SPY and rejects cashflow or provenance breaks [28]. At the first close, Finly was +$95.32 versus SPY -$57.99 at 4:00 p.m. ET: +$153.31 after 15 ETF fill events and zero external cashflows [35].</w:t>
       </w:r>
     </w:p>
     <w:p>
@@ -7432,7 +7432,7 @@
           <w:color w:val="171717"/>
           <w:sz w:val="22"/>
         </w:rPr>
-        <w:t>The strongest claim is not that an LLM found a guaranteed trade. It is that the division of authority is executable: the model reads; code computes; the permit binds; Alpaca records; and a public scorer measures without rewriting the rule.</w:t>
+        <w:t>The strongest claim is not that an LLM found a guaranteed trade. It is that the division of authority is executable: the model reads; code computes; the permit binds one exact options plan; Alpaca records the allocation execution; and a public scorer measures the complete account without rewriting the rule.</w:t>
       </w:r>
     </w:p>
     <w:p>
@@ -7715,7 +7715,7 @@
           <w:color w:val="171717"/>
           <w:sz w:val="22"/>
         </w:rPr>
-        <w:t>Finly combines a frozen quantitative sleeve, an AI evidence reader, a deterministic options compiler, and restart-safe Alpaca execution without pretending they are one model. G4 supplies a compelling historical reason to test: $10,000 became $106,711 versus $68,082 for SPY. The failed statistical, control, and source gates supply the reason to be careful.</w:t>
+        <w:t>Finly is one autonomous competition strategy with two coordinated execution sleeves; it does not pretend that their models, signals, or risk accounts are interchangeable. The four-fund sleeve supplies a compelling historical reason to test: $10,000 became $106,711 versus $68,082 for SPY. The failed statistical, control, and source gates supply the reason to be careful.</w:t>
       </w:r>
     </w:p>
     <w:p>
@@ -7734,7 +7734,7 @@
           <w:color w:val="171717"/>
           <w:sz w:val="22"/>
         </w:rPr>
-        <w:t>The system turns that tension into design. A separate SPY/BIL rule bounds options direction. News may reduce or veto but cannot amplify it. Code owns payoff, EV gates, quantity, loss, and broker fields. A short-lived HMAC certificate binds one state to one projection. Encrypted checkpoints and deterministic IDs make uncertain acknowledgements recoverable. The paper account then observes what happens without changing the rule.</w:t>
+        <w:t>The system turns that tension into design. A distinct SPY/BIL rule bounds the coordinated options sleeve's direction. News may reduce or veto but cannot amplify it. Code owns payoff, EV gates, quantity, loss, and broker fields. A short-lived HMAC certificate binds one state to one projection. Encrypted checkpoints and deterministic IDs make uncertain acknowledgements recoverable. The paper account then observes what happens without changing the rule.</w:t>
       </w:r>
     </w:p>
     <w:p>

</xml_diff>

<commit_message>
Finalize options-track submission package
</commit_message>
<xml_diff>
--- a/public/judge/Finly_Engineering_Appendix.docx
+++ b/public/judge/Finly_Engineering_Appendix.docx
@@ -139,7 +139,7 @@
           <w:color w:val="171717"/>
           <w:sz w:val="20"/>
         </w:rPr>
-        <w:t>The coordinated SPY options sleeve uses a distinct long-only SPY/BIL policy to supply a bounded bullish direction or no-trade authority. Deterministic market and option-surface evidence must confirm that direction. Qwen3-32B, hosted through Featherless, sees only canonical public Alpaca news and is reduction-only: supportive prose cannot increase exposure, while adverse evidence may reduce or veto a proposal. Code enumerates defined-risk vertical debit spreads, evaluates two 2,048-path scenario models, applies conservative expected-value and probability gates, sizes maximum loss, and issues a thirty-second HMAC-signed risk certificate bound to one exact order projection. Alpaca execution proceeds through a durable state machine, deterministic client-order identifiers, pre-mutation checkpoints, broker read-back, and fail-closed reconciliation.</w:t>
+        <w:t>The coordinated SPY options sleeve uses the frozen long-only SPY/BIL receipt as a freshness and long-horizon risk-on guard, not as the short-horizon trade direction. In live policy v2, fresh SPY price momentum owns the bullish or bearish sign. Option skew and Qwen3-32B's assessment of canonical public Alpaca news may confirm, reduce, or veto that signed view but cannot reverse it. Code enumerates defined-risk bull-call or bear-put debit spreads, evaluates two 2,048-path scenario models, applies conservative expected-value and probability gates, limits live entry to one contract and at most $500 of loss, and issues a thirty-second HMAC-signed v3 risk certificate bound to one exact order projection. Alpaca execution proceeds through a fresh preflight, durable state machine, deterministic client-order identifiers, pre-mutation checkpoints, broker read-back, and fail-closed reconciliation.</w:t>
       </w:r>
     </w:p>
     <w:p>
@@ -251,7 +251,7 @@
           <w:color w:val="171717"/>
           <w:sz w:val="20"/>
         </w:rPr>
-        <w:t xml:space="preserve"> G4 supplies a frozen four-fund allocation for the time-bounded competition account. The capped-risk options sleeve uses a distinct SPY/BIL economic authority instead of inferring direction from the G4 backtest; separate signals and risk accounts preserve auditability without creating a second competition strategy.</w:t>
+        <w:t xml:space="preserve"> G4 supplies a frozen four-fund allocation for the time-bounded competition account. The capped-risk options sleeve uses a distinct signed live policy instead of inferring direction from the G4 backtest; separate signals and risk accounts preserve auditability without creating a second competition strategy.</w:t>
       </w:r>
     </w:p>
     <w:p>
@@ -280,7 +280,7 @@
           <w:color w:val="171717"/>
           <w:sz w:val="20"/>
         </w:rPr>
-        <w:t>Reduction-only model authority.</w:t>
+        <w:t>Signed price authority with reduction-only confirmation.</w:t>
       </w:r>
       <w:r>
         <w:rPr>
@@ -290,7 +290,7 @@
           <w:color w:val="171717"/>
           <w:sz w:val="20"/>
         </w:rPr>
-        <w:t xml:space="preserve"> The hosted model extracts bounded scores and rationales from canonical public news. It cannot amplify the deterministic direction, choose an option, choose quantity, access account secrets, or authorize a broker mutation.</w:t>
+        <w:t xml:space="preserve"> Fresh market momentum owns the short-horizon sign. Option skew and the hosted model's bounded news assessments may confirm, reduce, or veto that view, but cannot reverse it, choose an option, choose quantity, access account secrets, or authorize a broker mutation.</w:t>
       </w:r>
     </w:p>
     <w:p>
@@ -388,6 +388,143 @@
           <w:sz w:val="22"/>
         </w:rPr>
         <w:t>Research, synthetic demonstration, paper authorization, and broker observation are distinct. A replay is not a fill, a fixture is not an executable permit, and a paper fill is not real-capital execution. Tests establish software behavior, not forecast accuracy [1–7].</w:t>
+      </w:r>
+    </w:p>
+    <w:p>
+      <w:pPr>
+        <w:keepNext/>
+        <w:spacing w:before="160" w:after="80"/>
+      </w:pPr>
+      <w:r>
+        <w:rPr>
+          <w:rFonts w:ascii="Times New Roman" w:hAnsi="Times New Roman" w:eastAsia="Times New Roman"/>
+          <w:b/>
+          <w:i/>
+          <w:color w:val="171717"/>
+          <w:sz w:val="22"/>
+        </w:rPr>
+        <w:t>1.1 Versioned live-policy provenance</w:t>
+      </w:r>
+    </w:p>
+    <w:p>
+      <w:pPr>
+        <w:keepLines/>
+        <w:widowControl/>
+        <w:spacing w:line="276" w:lineRule="auto" w:after="120"/>
+        <w:ind w:firstLine="0"/>
+        <w:jc w:val="both"/>
+      </w:pPr>
+      <w:r>
+        <w:rPr>
+          <w:rFonts w:ascii="Times New Roman" w:hAnsi="Times New Roman" w:eastAsia="Times New Roman"/>
+          <w:b w:val="0"/>
+          <w:i w:val="0"/>
+          <w:color w:val="171717"/>
+          <w:sz w:val="22"/>
+        </w:rPr>
+        <w:t xml:space="preserve">The G4 allocation rule, historical ledger, frozen SPY/BIL economic research, and first-session measurements were not revised. After the original options policy produced repeated </w:t>
+      </w:r>
+      <w:r>
+        <w:rPr>
+          <w:rFonts w:ascii="Menlo" w:hAnsi="Menlo" w:eastAsia="Menlo"/>
+          <w:b w:val="0"/>
+          <w:i w:val="0"/>
+          <w:color w:val="171717"/>
+          <w:sz w:val="20"/>
+        </w:rPr>
+        <w:t>NO_TRADE</w:t>
+      </w:r>
+      <w:r>
+        <w:rPr>
+          <w:rFonts w:ascii="Times New Roman" w:hAnsi="Times New Roman" w:eastAsia="Times New Roman"/>
+          <w:b w:val="0"/>
+          <w:i w:val="0"/>
+          <w:color w:val="171717"/>
+          <w:sz w:val="22"/>
+        </w:rPr>
+        <w:t xml:space="preserve"> decisions, Finly activated bidirectional live policy v2 at </w:t>
+      </w:r>
+      <w:r>
+        <w:rPr>
+          <w:rFonts w:ascii="Times New Roman" w:hAnsi="Times New Roman" w:eastAsia="Times New Roman"/>
+          <w:b/>
+          <w:i w:val="0"/>
+          <w:color w:val="171717"/>
+          <w:sz w:val="22"/>
+        </w:rPr>
+        <w:t>3:28:21 UTC</w:t>
+      </w:r>
+      <w:r>
+        <w:rPr>
+          <w:rFonts w:ascii="Times New Roman" w:hAnsi="Times New Roman" w:eastAsia="Times New Roman"/>
+          <w:b w:val="0"/>
+          <w:i w:val="0"/>
+          <w:color w:val="171717"/>
+          <w:sz w:val="22"/>
+        </w:rPr>
+        <w:t xml:space="preserve"> and a prospective asymmetric-payoff calibration at </w:t>
+      </w:r>
+      <w:r>
+        <w:rPr>
+          <w:rFonts w:ascii="Times New Roman" w:hAnsi="Times New Roman" w:eastAsia="Times New Roman"/>
+          <w:b/>
+          <w:i w:val="0"/>
+          <w:color w:val="171717"/>
+          <w:sz w:val="22"/>
+        </w:rPr>
+        <w:t>4:08:18 UTC on 2 September 2026</w:t>
+      </w:r>
+      <w:r>
+        <w:rPr>
+          <w:rFonts w:ascii="Times New Roman" w:hAnsi="Times New Roman" w:eastAsia="Times New Roman"/>
+          <w:b w:val="0"/>
+          <w:i w:val="0"/>
+          <w:color w:val="171717"/>
+          <w:sz w:val="22"/>
+        </w:rPr>
+        <w:t xml:space="preserve">. The cloud workflow in revision </w:t>
+      </w:r>
+      <w:hyperlink r:id="rId12">
+        <w:r>
+          <w:rPr>
+            <w:rFonts w:ascii="Times New Roman" w:hAnsi="Times New Roman"/>
+            <w:color w:val="1F5A4C"/>
+            <w:sz w:val="22"/>
+            <w:u w:val="single"/>
+          </w:rPr>
+          <w:t>`d8e1fcc`</w:t>
+        </w:r>
+      </w:hyperlink>
+      <w:r>
+        <w:rPr>
+          <w:rFonts w:ascii="Times New Roman" w:hAnsi="Times New Roman" w:eastAsia="Times New Roman"/>
+          <w:b w:val="0"/>
+          <w:i w:val="0"/>
+          <w:color w:val="171717"/>
+          <w:sz w:val="22"/>
+        </w:rPr>
+        <w:t xml:space="preserve"> pins implementation </w:t>
+      </w:r>
+      <w:hyperlink r:id="rId13">
+        <w:r>
+          <w:rPr>
+            <w:rFonts w:ascii="Times New Roman" w:hAnsi="Times New Roman"/>
+            <w:color w:val="1F5A4C"/>
+            <w:sz w:val="22"/>
+            <w:u w:val="single"/>
+          </w:rPr>
+          <w:t>`318c943`</w:t>
+        </w:r>
+      </w:hyperlink>
+      <w:r>
+        <w:rPr>
+          <w:rFonts w:ascii="Times New Roman" w:hAnsi="Times New Roman" w:eastAsia="Times New Roman"/>
+          <w:b w:val="0"/>
+          <w:i w:val="0"/>
+          <w:color w:val="171717"/>
+          <w:sz w:val="22"/>
+        </w:rPr>
+        <w:t>: fresh market momentum may select a bounded bullish or bearish view, while the frozen economic receipt remains a freshness and risk-on guard. A candidate must show positive conservative value, at least 1.25-to-1 reward/risk, and at least 45 percent modeled probability of profit. The $500 loss ceiling, 0.5-percent equity budget, one-contract limit, paper-only endpoint, HMAC permit, final preflight, idempotent order identity, and broker reconciliation remained hard controls. Every earlier decision and P&amp;L observation remains attributed to the policy revision that produced it. No live options fill is claimed.</w:t>
       </w:r>
     </w:p>
     <w:p>
@@ -555,7 +692,7 @@
           <w:color w:val="171717"/>
           <w:sz w:val="15"/>
         </w:rPr>
-        <w:t>Alpaca SPY/BIL bars ── deterministic economic policy ── bullish cap / NO_TRADE</w:t>
+        <w:t>Alpaca SPY/BIL bars ── frozen freshness + risk-on guard ──────────┐</w:t>
         <w:br/>
       </w:r>
       <w:r>
@@ -566,7 +703,7 @@
           <w:color w:val="171717"/>
           <w:sz w:val="15"/>
         </w:rPr>
-        <w:t>Alpaca SPY market ───── deterministic market score ───────────────┐</w:t>
+        <w:t>Alpaca SPY market ───── price-momentum sign: bull / bear / neutral├──┐</w:t>
         <w:br/>
       </w:r>
       <w:r>
@@ -577,7 +714,7 @@
           <w:color w:val="171717"/>
           <w:sz w:val="15"/>
         </w:rPr>
-        <w:t>Alpaca option chain ─── deterministic option-surface score ──────┤</w:t>
+        <w:t>Alpaca option chain ─── deterministic confirmation / reduction ──┤  │</w:t>
         <w:br/>
       </w:r>
       <w:r>
@@ -588,7 +725,7 @@
           <w:color w:val="171717"/>
           <w:sz w:val="15"/>
         </w:rPr>
-        <w:t>Alpaca public news ──── Qwen structured assessment ── reduce/veto┤</w:t>
+        <w:t>Alpaca public news ──── Qwen confirmation / reduction / veto ────┘  │</w:t>
         <w:br/>
       </w:r>
       <w:r>
@@ -654,7 +791,7 @@
           <w:color w:val="171717"/>
           <w:sz w:val="15"/>
         </w:rPr>
-        <w:t xml:space="preserve">                              source-removal + 32-case perturbation challenge</w:t>
+        <w:t xml:space="preserve">                              source-removal + 32-case alpha diagnostics</w:t>
         <w:br/>
       </w:r>
       <w:r>
@@ -1027,7 +1164,7 @@
                 <w:color w:val="171717"/>
                 <w:sz w:val="15"/>
               </w:rPr>
-              <w:t>SPY/BIL economic policy</w:t>
+              <w:t>Frozen SPY/BIL economic receipt</w:t>
             </w:r>
           </w:p>
         </w:tc>
@@ -1054,7 +1191,7 @@
                 <w:color w:val="171717"/>
                 <w:sz w:val="15"/>
               </w:rPr>
-              <w:t>Maximum long-only SPY weight or no trade</w:t>
+              <w:t>Freshness and long-horizon risk-on gate</w:t>
             </w:r>
           </w:p>
         </w:tc>
@@ -1081,7 +1218,7 @@
                 <w:color w:val="171717"/>
                 <w:sz w:val="15"/>
               </w:rPr>
-              <w:t>Contract, quantity, or broker payload</w:t>
+              <w:t>Short-horizon sign, contract, quantity, or broker payload</w:t>
             </w:r>
           </w:p>
         </w:tc>
@@ -1114,7 +1251,7 @@
                 <w:color w:val="171717"/>
                 <w:sz w:val="15"/>
               </w:rPr>
-              <w:t>Qwen news assessor</w:t>
+              <w:t>Market-momentum policy</w:t>
             </w:r>
           </w:p>
         </w:tc>
@@ -1142,7 +1279,7 @@
                 <w:color w:val="171717"/>
                 <w:sz w:val="15"/>
               </w:rPr>
-              <w:t>Bounded event scores and rationales</w:t>
+              <w:t>Bullish, bearish, or neutral short-horizon sign</w:t>
             </w:r>
           </w:p>
         </w:tc>
@@ -1170,7 +1307,7 @@
                 <w:color w:val="171717"/>
                 <w:sz w:val="15"/>
               </w:rPr>
-              <w:t>Direction amplification, contract, size, credentials, mutation</w:t>
+              <w:t>Contract, quantity, credentials, or mutation</w:t>
             </w:r>
           </w:p>
         </w:tc>
@@ -1202,6 +1339,93 @@
                 <w:color w:val="171717"/>
                 <w:sz w:val="15"/>
               </w:rPr>
+              <w:t>Options and Qwen confirmation</w:t>
+            </w:r>
+          </w:p>
+        </w:tc>
+        <w:tc>
+          <w:tcPr>
+            <w:tcW w:type="dxa" w:w="3120"/>
+            <w:vAlign w:val="center"/>
+            <w:tcMar>
+              <w:top w:w="72" w:type="dxa"/>
+              <w:start w:w="80" w:type="dxa"/>
+              <w:bottom w:w="72" w:type="dxa"/>
+              <w:end w:w="80" w:type="dxa"/>
+            </w:tcMar>
+          </w:tcPr>
+          <w:p>
+            <w:pPr>
+              <w:spacing w:before="0" w:after="0" w:line="240" w:lineRule="auto"/>
+            </w:pPr>
+            <w:r>
+              <w:rPr>
+                <w:rFonts w:ascii="Arial" w:hAnsi="Arial" w:eastAsia="Arial"/>
+                <w:b w:val="0"/>
+                <w:i w:val="0"/>
+                <w:color w:val="171717"/>
+                <w:sz w:val="15"/>
+              </w:rPr>
+              <w:t>Bounded confirmation, reduction, or veto</w:t>
+            </w:r>
+          </w:p>
+        </w:tc>
+        <w:tc>
+          <w:tcPr>
+            <w:tcW w:type="dxa" w:w="3120"/>
+            <w:vAlign w:val="center"/>
+            <w:tcMar>
+              <w:top w:w="72" w:type="dxa"/>
+              <w:start w:w="80" w:type="dxa"/>
+              <w:bottom w:w="72" w:type="dxa"/>
+              <w:end w:w="80" w:type="dxa"/>
+            </w:tcMar>
+          </w:tcPr>
+          <w:p>
+            <w:pPr>
+              <w:spacing w:before="0" w:after="0" w:line="240" w:lineRule="auto"/>
+            </w:pPr>
+            <w:r>
+              <w:rPr>
+                <w:rFonts w:ascii="Arial" w:hAnsi="Arial" w:eastAsia="Arial"/>
+                <w:b w:val="0"/>
+                <w:i w:val="0"/>
+                <w:color w:val="171717"/>
+                <w:sz w:val="15"/>
+              </w:rPr>
+              <w:t>Sign reversal, contract, size, credentials, mutation</w:t>
+            </w:r>
+          </w:p>
+        </w:tc>
+      </w:tr>
+      <w:tr>
+        <w:trPr>
+          <w:cantSplit/>
+        </w:trPr>
+        <w:tc>
+          <w:tcPr>
+            <w:tcW w:type="dxa" w:w="3120"/>
+            <w:vAlign w:val="center"/>
+            <w:tcMar>
+              <w:top w:w="72" w:type="dxa"/>
+              <w:start w:w="80" w:type="dxa"/>
+              <w:bottom w:w="72" w:type="dxa"/>
+              <w:end w:w="80" w:type="dxa"/>
+            </w:tcMar>
+            <w:shd w:fill="F3F5F2"/>
+          </w:tcPr>
+          <w:p>
+            <w:pPr>
+              <w:spacing w:before="0" w:after="0" w:line="240" w:lineRule="auto"/>
+            </w:pPr>
+            <w:r>
+              <w:rPr>
+                <w:rFonts w:ascii="Arial" w:hAnsi="Arial" w:eastAsia="Arial"/>
+                <w:b w:val="0"/>
+                <w:i w:val="0"/>
+                <w:color w:val="171717"/>
+                <w:sz w:val="15"/>
+              </w:rPr>
               <w:t>Deterministic compiler</w:t>
             </w:r>
           </w:p>
@@ -1216,6 +1440,7 @@
               <w:bottom w:w="72" w:type="dxa"/>
               <w:end w:w="80" w:type="dxa"/>
             </w:tcMar>
+            <w:shd w:fill="F3F5F2"/>
           </w:tcPr>
           <w:p>
             <w:pPr>
@@ -1243,6 +1468,7 @@
               <w:bottom w:w="72" w:type="dxa"/>
               <w:end w:w="80" w:type="dxa"/>
             </w:tcMar>
+            <w:shd w:fill="F3F5F2"/>
           </w:tcPr>
           <w:p>
             <w:pPr>
@@ -1275,7 +1501,6 @@
               <w:bottom w:w="72" w:type="dxa"/>
               <w:end w:w="80" w:type="dxa"/>
             </w:tcMar>
-            <w:shd w:fill="F3F5F2"/>
           </w:tcPr>
           <w:p>
             <w:pPr>
@@ -1303,7 +1528,6 @@
               <w:bottom w:w="72" w:type="dxa"/>
               <w:end w:w="80" w:type="dxa"/>
             </w:tcMar>
-            <w:shd w:fill="F3F5F2"/>
           </w:tcPr>
           <w:p>
             <w:pPr>
@@ -1331,7 +1555,6 @@
               <w:bottom w:w="72" w:type="dxa"/>
               <w:end w:w="80" w:type="dxa"/>
             </w:tcMar>
-            <w:shd w:fill="F3F5F2"/>
           </w:tcPr>
           <w:p>
             <w:pPr>
@@ -1364,6 +1587,7 @@
               <w:bottom w:w="72" w:type="dxa"/>
               <w:end w:w="80" w:type="dxa"/>
             </w:tcMar>
+            <w:shd w:fill="F3F5F2"/>
           </w:tcPr>
           <w:p>
             <w:pPr>
@@ -1391,6 +1615,7 @@
               <w:bottom w:w="72" w:type="dxa"/>
               <w:end w:w="80" w:type="dxa"/>
             </w:tcMar>
+            <w:shd w:fill="F3F5F2"/>
           </w:tcPr>
           <w:p>
             <w:pPr>
@@ -1418,6 +1643,7 @@
               <w:bottom w:w="72" w:type="dxa"/>
               <w:end w:w="80" w:type="dxa"/>
             </w:tcMar>
+            <w:shd w:fill="F3F5F2"/>
           </w:tcPr>
           <w:p>
             <w:pPr>
@@ -4796,7 +5022,7 @@
           <w:color w:val="171717"/>
           <w:sz w:val="27"/>
         </w:rPr>
-        <w:t>6. The options sleeve's distinct SPY/BIL authority</w:t>
+        <w:t>6. Frozen economic research and the live risk-on guard</w:t>
       </w:r>
     </w:p>
     <w:p>
@@ -4815,7 +5041,7 @@
           <w:color w:val="171717"/>
           <w:sz w:val="22"/>
         </w:rPr>
-        <w:t>G4 chooses the competition equity sleeve; it does not authorize options. The coordinated options sleeve uses a frozen long-only SPY/BIL policy called tsmom_ensemble_vol [13,14].</w:t>
+        <w:t>G4 chooses the competition equity sleeve; it does not authorize options. A separate frozen long-only SPY/BIL policy called tsmom_ensemble_vol supplies a reproducible long-horizon economic receipt [13,14]. Live v2 reuses that checked receipt only as a freshness and risk-on guard; it does not use the receipt to choose bullish versus bearish short-horizon direction [36].</w:t>
       </w:r>
     </w:p>
     <w:p>
@@ -4912,7 +5138,7 @@
           <w:color w:val="171717"/>
           <w:sz w:val="22"/>
         </w:rPr>
-        <w:t>The policy is unlevered, never shorts, and proposes a rebalance every five completed sessions. A daily bar becomes eligible only after regular close plus fifteen minutes, and SPY/BIL sessions must align. In research, a close-t signal executes at t+1 and first earns t+1-to-t+2 returns. In deployment it produces a hashed economic receipt and does not mutate the broker.</w:t>
+        <w:t>The frozen research policy is unlevered, never shorts, and proposes a rebalance every five completed sessions. A daily bar becomes eligible only after regular close plus fifteen minutes, and SPY/BIL sessions must align. In research, a close-t signal executes at t+1 and first earns t+1-to-t+2 returns. In deployment it produces a hashed economic receipt and does not mutate the broker.</w:t>
       </w:r>
     </w:p>
     <w:p>
@@ -4950,116 +5176,7 @@
           <w:color w:val="171717"/>
           <w:sz w:val="22"/>
         </w:rPr>
-        <w:t>For an options entry, the guard requires a fresh rebalance proposal and at least 50 percent indicated SPY exposure. If it passes, it supplies a bullish-only direction cap equal to the SPY weight. If it fails, the outcome is no trade. Thus the library supports bullish calls and bearish puts, but the competition's live-authorized path can advance only a bullish spread or no trade.</w:t>
-      </w:r>
-    </w:p>
-    <w:p>
-      <w:pPr>
-        <w:keepNext/>
-        <w:spacing w:before="260" w:after="100"/>
-      </w:pPr>
-      <w:r>
-        <w:rPr>
-          <w:rFonts w:ascii="Times New Roman" w:hAnsi="Times New Roman" w:eastAsia="Times New Roman"/>
-          <w:b/>
-          <w:i w:val="0"/>
-          <w:color w:val="171717"/>
-          <w:sz w:val="27"/>
-        </w:rPr>
-        <w:t>7. Evidence, model role, and deterministic intent</w:t>
-      </w:r>
-    </w:p>
-    <w:p>
-      <w:pPr>
-        <w:keepNext/>
-        <w:spacing w:before="160" w:after="80"/>
-      </w:pPr>
-      <w:r>
-        <w:rPr>
-          <w:rFonts w:ascii="Times New Roman" w:hAnsi="Times New Roman" w:eastAsia="Times New Roman"/>
-          <w:b/>
-          <w:i/>
-          <w:color w:val="171717"/>
-          <w:sz w:val="22"/>
-        </w:rPr>
-        <w:t>7.1 Canonical signals</w:t>
-      </w:r>
-    </w:p>
-    <w:p>
-      <w:pPr>
-        <w:keepLines/>
-        <w:widowControl/>
-        <w:spacing w:line="276" w:lineRule="auto" w:after="120"/>
-        <w:ind w:firstLine="0"/>
-        <w:jc w:val="both"/>
-      </w:pPr>
-      <w:r>
-        <w:rPr>
-          <w:rFonts w:ascii="Times New Roman" w:hAnsi="Times New Roman" w:eastAsia="Times New Roman"/>
-          <w:b w:val="0"/>
-          <w:i w:val="0"/>
-          <w:color w:val="171717"/>
-          <w:sz w:val="22"/>
-        </w:rPr>
-        <w:t>Every evidence record includes family, underlying, source kind and URI, origin ID, publication and receipt timestamps, content hash, duplicate-group hash, and an evidence ID derived from the canonical body. IDs, origins, and duplicate groups cannot cross families. A second signal from one family is rejected rather than double-counted [15,16].</w:t>
-      </w:r>
-    </w:p>
-    <w:p>
-      <w:pPr>
-        <w:keepLines/>
-        <w:widowControl/>
-        <w:spacing w:line="276" w:lineRule="auto" w:after="120"/>
-        <w:ind w:firstLine="346"/>
-        <w:jc w:val="both"/>
-      </w:pPr>
-      <w:r>
-        <w:rPr>
-          <w:rFonts w:ascii="Times New Roman" w:hAnsi="Times New Roman" w:eastAsia="Times New Roman"/>
-          <w:b w:val="0"/>
-          <w:i w:val="0"/>
-          <w:color w:val="171717"/>
-          <w:sz w:val="22"/>
-        </w:rPr>
-        <w:t>The deployed runner builds three live families.</w:t>
-      </w:r>
-    </w:p>
-    <w:p>
-      <w:pPr>
-        <w:keepLines/>
-        <w:widowControl/>
-        <w:spacing w:line="259" w:lineRule="auto" w:after="70"/>
-        <w:ind w:left="547" w:hanging="259"/>
-        <w:jc w:val="left"/>
-      </w:pPr>
-      <w:r>
-        <w:rPr>
-          <w:rFonts w:ascii="Times New Roman" w:hAnsi="Times New Roman" w:eastAsia="Times New Roman"/>
-          <w:b w:val="0"/>
-          <w:i w:val="0"/>
-          <w:color w:val="171717"/>
-          <w:sz w:val="20"/>
-        </w:rPr>
-        <w:t xml:space="preserve">• </w:t>
-      </w:r>
-      <w:r>
-        <w:rPr>
-          <w:rFonts w:ascii="Times New Roman" w:hAnsi="Times New Roman" w:eastAsia="Times New Roman"/>
-          <w:b/>
-          <w:i w:val="0"/>
-          <w:color w:val="171717"/>
-          <w:sz w:val="20"/>
-        </w:rPr>
-        <w:t>Market.</w:t>
-      </w:r>
-      <w:r>
-        <w:rPr>
-          <w:rFonts w:ascii="Times New Roman" w:hAnsi="Times New Roman" w:eastAsia="Times New Roman"/>
-          <w:b w:val="0"/>
-          <w:i w:val="0"/>
-          <w:color w:val="171717"/>
-          <w:sz w:val="20"/>
-        </w:rPr>
-        <w:t xml:space="preserve"> With twenty recent SPY log returns and volatility σ:</w:t>
+        <w:t>For an options entry, the guard requires a fresh checked receipt and at least 50 percent indicated SPY exposure. If it fails, the outcome is no trade. If it passes, the current live path derives bounded directional capacity from the checked SPY weight,</w:t>
       </w:r>
     </w:p>
     <w:p>
@@ -5079,7 +5196,96 @@
           <w:color w:val="171717"/>
           <w:sz w:val="20"/>
         </w:rPr>
-        <w:t>z_market = 0.65 M₅/(σ√5) + 0.35 M₂₀/(σ√20); d_market = tanh(z_market/2).</w:t>
+        <w:t>u(t) = 0.5 + 0.5|w_SPY(t)-0.5|,</w:t>
+      </w:r>
+    </w:p>
+    <w:p>
+      <w:pPr>
+        <w:keepLines/>
+        <w:widowControl/>
+        <w:spacing w:line="276" w:lineRule="auto" w:after="120"/>
+        <w:ind w:firstLine="346"/>
+        <w:jc w:val="both"/>
+      </w:pPr>
+      <w:r>
+        <w:rPr>
+          <w:rFonts w:ascii="Times New Roman" w:hAnsi="Times New Roman" w:eastAsia="Times New Roman"/>
+          <w:b w:val="0"/>
+          <w:i w:val="0"/>
+          <w:color w:val="171717"/>
+          <w:sz w:val="22"/>
+        </w:rPr>
+        <w:t>but leaves the short-horizon sign to fresh SPY price momentum. This preserves the frozen research artifact without converting its long-only allocation into a bullish-only options rule.</w:t>
+      </w:r>
+    </w:p>
+    <w:p>
+      <w:pPr>
+        <w:keepNext/>
+        <w:spacing w:before="260" w:after="100"/>
+      </w:pPr>
+      <w:r>
+        <w:rPr>
+          <w:rFonts w:ascii="Times New Roman" w:hAnsi="Times New Roman" w:eastAsia="Times New Roman"/>
+          <w:b/>
+          <w:i w:val="0"/>
+          <w:color w:val="171717"/>
+          <w:sz w:val="27"/>
+        </w:rPr>
+        <w:t>7. Evidence, model role, and deterministic intent</w:t>
+      </w:r>
+    </w:p>
+    <w:p>
+      <w:pPr>
+        <w:keepNext/>
+        <w:spacing w:before="160" w:after="80"/>
+      </w:pPr>
+      <w:r>
+        <w:rPr>
+          <w:rFonts w:ascii="Times New Roman" w:hAnsi="Times New Roman" w:eastAsia="Times New Roman"/>
+          <w:b/>
+          <w:i/>
+          <w:color w:val="171717"/>
+          <w:sz w:val="22"/>
+        </w:rPr>
+        <w:t>7.1 Canonical signals</w:t>
+      </w:r>
+    </w:p>
+    <w:p>
+      <w:pPr>
+        <w:keepLines/>
+        <w:widowControl/>
+        <w:spacing w:line="276" w:lineRule="auto" w:after="120"/>
+        <w:ind w:firstLine="0"/>
+        <w:jc w:val="both"/>
+      </w:pPr>
+      <w:r>
+        <w:rPr>
+          <w:rFonts w:ascii="Times New Roman" w:hAnsi="Times New Roman" w:eastAsia="Times New Roman"/>
+          <w:b w:val="0"/>
+          <w:i w:val="0"/>
+          <w:color w:val="171717"/>
+          <w:sz w:val="22"/>
+        </w:rPr>
+        <w:t>Every evidence record includes family, underlying, source kind and URI, origin ID, publication and receipt timestamps, content hash, duplicate-group hash, and an evidence ID derived from the canonical body. IDs, origins, and duplicate groups cannot cross families. A second signal from one family is rejected rather than double-counted [15,16].</w:t>
+      </w:r>
+    </w:p>
+    <w:p>
+      <w:pPr>
+        <w:keepLines/>
+        <w:widowControl/>
+        <w:spacing w:line="276" w:lineRule="auto" w:after="120"/>
+        <w:ind w:firstLine="346"/>
+        <w:jc w:val="both"/>
+      </w:pPr>
+      <w:r>
+        <w:rPr>
+          <w:rFonts w:ascii="Times New Roman" w:hAnsi="Times New Roman" w:eastAsia="Times New Roman"/>
+          <w:b w:val="0"/>
+          <w:i w:val="0"/>
+          <w:color w:val="171717"/>
+          <w:sz w:val="22"/>
+        </w:rPr>
+        <w:t>The deployed runner builds three live families.</w:t>
       </w:r>
     </w:p>
     <w:p>
@@ -5108,7 +5314,7 @@
           <w:color w:val="171717"/>
           <w:sz w:val="20"/>
         </w:rPr>
-        <w:t>Options.</w:t>
+        <w:t>Market.</w:t>
       </w:r>
       <w:r>
         <w:rPr>
@@ -5118,7 +5324,7 @@
           <w:color w:val="171717"/>
           <w:sz w:val="20"/>
         </w:rPr>
-        <w:t xml:space="preserve"> At the earliest expiry with both rights, code selects nearest-to-spot call and put. For κ = IV_put − IV_call:</w:t>
+        <w:t xml:space="preserve"> With twenty recent SPY log returns and volatility σ:</w:t>
       </w:r>
     </w:p>
     <w:p>
@@ -5138,7 +5344,7 @@
           <w:color w:val="171717"/>
           <w:sz w:val="20"/>
         </w:rPr>
-        <w:t>d_options = −tanh(κ/0.035).</w:t>
+        <w:t>z_market = 0.65 M₅/(σ√5) + 0.35 M₂₀/(σ√20); d_market = tanh(z_market/2).</w:t>
       </w:r>
     </w:p>
     <w:p>
@@ -5167,7 +5373,7 @@
           <w:color w:val="171717"/>
           <w:sz w:val="20"/>
         </w:rPr>
-        <w:t>Events.</w:t>
+        <w:t>Options.</w:t>
       </w:r>
       <w:r>
         <w:rPr>
@@ -5177,115 +5383,7 @@
           <w:color w:val="171717"/>
           <w:sz w:val="20"/>
         </w:rPr>
-        <w:t xml:space="preserve"> Up to twelve nonduplicated Alpaca news items no older than seventy-two hours receive age weights exp(−age_hours/24); the weighted model score is shrunk by 0.65.</w:t>
-      </w:r>
-    </w:p>
-    <w:p>
-      <w:pPr>
-        <w:keepLines/>
-        <w:widowControl/>
-        <w:spacing w:line="276" w:lineRule="auto" w:after="120"/>
-        <w:ind w:firstLine="346"/>
-        <w:jc w:val="both"/>
-      </w:pPr>
-      <w:r>
-        <w:rPr>
-          <w:rFonts w:ascii="Times New Roman" w:hAnsi="Times New Roman" w:eastAsia="Times New Roman"/>
-          <w:b w:val="0"/>
-          <w:i w:val="0"/>
-          <w:color w:val="171717"/>
-          <w:sz w:val="22"/>
-        </w:rPr>
-        <w:t>The schema also supports a prediction-market family with base weight 0.05, and the complete synthetic fixture exercises it. The current autonomous live builder has no production prediction-market feed. It is a supported family, not a current live source.</w:t>
-      </w:r>
-    </w:p>
-    <w:p>
-      <w:pPr>
-        <w:keepNext/>
-        <w:spacing w:before="160" w:after="80"/>
-      </w:pPr>
-      <w:r>
-        <w:rPr>
-          <w:rFonts w:ascii="Times New Roman" w:hAnsi="Times New Roman" w:eastAsia="Times New Roman"/>
-          <w:b/>
-          <w:i/>
-          <w:color w:val="171717"/>
-          <w:sz w:val="22"/>
-        </w:rPr>
-        <w:t>7.2 Hosted model boundary</w:t>
-      </w:r>
-    </w:p>
-    <w:p>
-      <w:pPr>
-        <w:keepLines/>
-        <w:widowControl/>
-        <w:spacing w:line="276" w:lineRule="auto" w:after="120"/>
-        <w:ind w:firstLine="0"/>
-        <w:jc w:val="both"/>
-      </w:pPr>
-      <w:r>
-        <w:rPr>
-          <w:rFonts w:ascii="Times New Roman" w:hAnsi="Times New Roman" w:eastAsia="Times New Roman"/>
-          <w:b w:val="0"/>
-          <w:i w:val="0"/>
-          <w:color w:val="171717"/>
-          <w:sz w:val="22"/>
-        </w:rPr>
-        <w:t>Qwen3-32B receives only canonical public news text, required evidence IDs, underlying, and timestamp. Temperature is zero, extended thinking is disabled, and output must contain exactly one assessment per ID: direction score, volatility score, and short rationale. Unknown keys, missing or duplicate IDs, nonfinite scores, malformed JSON, timeout, identity mismatch, or hash mismatch fails extraction [17].</w:t>
-      </w:r>
-    </w:p>
-    <w:p>
-      <w:pPr>
-        <w:keepLines/>
-        <w:widowControl/>
-        <w:spacing w:line="276" w:lineRule="auto" w:after="120"/>
-        <w:ind w:firstLine="346"/>
-        <w:jc w:val="both"/>
-      </w:pPr>
-      <w:r>
-        <w:rPr>
-          <w:rFonts w:ascii="Times New Roman" w:hAnsi="Times New Roman" w:eastAsia="Times New Roman"/>
-          <w:b w:val="0"/>
-          <w:i w:val="0"/>
-          <w:color w:val="171717"/>
-          <w:sz w:val="22"/>
-        </w:rPr>
-        <w:t>The model has no account identifier, credential, equity, buying power, position, compiler state, risk object, candidate list, order payload, or mutation tool. Source text is untrusted data, not instructions. Model output is evidence assessment, not a trade.</w:t>
-      </w:r>
-    </w:p>
-    <w:p>
-      <w:pPr>
-        <w:keepNext/>
-        <w:spacing w:before="160" w:after="80"/>
-      </w:pPr>
-      <w:r>
-        <w:rPr>
-          <w:rFonts w:ascii="Times New Roman" w:hAnsi="Times New Roman" w:eastAsia="Times New Roman"/>
-          <w:b/>
-          <w:i/>
-          <w:color w:val="171717"/>
-          <w:sz w:val="22"/>
-        </w:rPr>
-        <w:t>7.3 Aggregation and reduction-only authority</w:t>
-      </w:r>
-    </w:p>
-    <w:p>
-      <w:pPr>
-        <w:keepLines/>
-        <w:widowControl/>
-        <w:spacing w:line="276" w:lineRule="auto" w:after="120"/>
-        <w:ind w:firstLine="0"/>
-        <w:jc w:val="both"/>
-      </w:pPr>
-      <w:r>
-        <w:rPr>
-          <w:rFonts w:ascii="Times New Roman" w:hAnsi="Times New Roman" w:eastAsia="Times New Roman"/>
-          <w:b w:val="0"/>
-          <w:i w:val="0"/>
-          <w:color w:val="171717"/>
-          <w:sz w:val="22"/>
-        </w:rPr>
-        <w:t>For family j,</w:t>
+        <w:t xml:space="preserve"> At the earliest expiry with both rights, code selects nearest-to-spot call and put. For κ = IV_put − IV_call:</w:t>
       </w:r>
     </w:p>
     <w:p>
@@ -5305,7 +5403,46 @@
           <w:color w:val="171717"/>
           <w:sz w:val="20"/>
         </w:rPr>
-        <w:t>a_j = b_j × quality_j × freshness_j × calibration_j × independence_j,</w:t>
+        <w:t>d_options = −tanh(κ/0.035).</w:t>
+      </w:r>
+    </w:p>
+    <w:p>
+      <w:pPr>
+        <w:keepLines/>
+        <w:widowControl/>
+        <w:spacing w:line="259" w:lineRule="auto" w:after="70"/>
+        <w:ind w:left="547" w:hanging="259"/>
+        <w:jc w:val="left"/>
+      </w:pPr>
+      <w:r>
+        <w:rPr>
+          <w:rFonts w:ascii="Times New Roman" w:hAnsi="Times New Roman" w:eastAsia="Times New Roman"/>
+          <w:b w:val="0"/>
+          <w:i w:val="0"/>
+          <w:color w:val="171717"/>
+          <w:sz w:val="20"/>
+        </w:rPr>
+        <w:t xml:space="preserve">• </w:t>
+      </w:r>
+      <w:r>
+        <w:rPr>
+          <w:rFonts w:ascii="Times New Roman" w:hAnsi="Times New Roman" w:eastAsia="Times New Roman"/>
+          <w:b/>
+          <w:i w:val="0"/>
+          <w:color w:val="171717"/>
+          <w:sz w:val="20"/>
+        </w:rPr>
+        <w:t>Events.</w:t>
+      </w:r>
+      <w:r>
+        <w:rPr>
+          <w:rFonts w:ascii="Times New Roman" w:hAnsi="Times New Roman" w:eastAsia="Times New Roman"/>
+          <w:b w:val="0"/>
+          <w:i w:val="0"/>
+          <w:color w:val="171717"/>
+          <w:sz w:val="20"/>
+        </w:rPr>
+        <w:t xml:space="preserve"> Up to twelve nonduplicated Alpaca news items no older than seventy-two hours receive age weights exp(−age_hours/24); the weighted model score is shrunk by 0.65.</w:t>
       </w:r>
     </w:p>
     <w:p>
@@ -5324,7 +5461,96 @@
           <w:color w:val="171717"/>
           <w:sz w:val="22"/>
         </w:rPr>
-        <w:t>where base weights are 0.50 market, 0.20 options, 0.25 events, and 0.05 prediction market. In the generic library path,</w:t>
+        <w:t>The schema also supports a prediction-market family with base weight 0.05, and the complete synthetic fixture exercises it. The current autonomous live builder has no production prediction-market feed. It is a supported family, not a current live source.</w:t>
+      </w:r>
+    </w:p>
+    <w:p>
+      <w:pPr>
+        <w:keepNext/>
+        <w:spacing w:before="160" w:after="80"/>
+      </w:pPr>
+      <w:r>
+        <w:rPr>
+          <w:rFonts w:ascii="Times New Roman" w:hAnsi="Times New Roman" w:eastAsia="Times New Roman"/>
+          <w:b/>
+          <w:i/>
+          <w:color w:val="171717"/>
+          <w:sz w:val="22"/>
+        </w:rPr>
+        <w:t>7.2 Hosted model boundary</w:t>
+      </w:r>
+    </w:p>
+    <w:p>
+      <w:pPr>
+        <w:keepLines/>
+        <w:widowControl/>
+        <w:spacing w:line="276" w:lineRule="auto" w:after="120"/>
+        <w:ind w:firstLine="0"/>
+        <w:jc w:val="both"/>
+      </w:pPr>
+      <w:r>
+        <w:rPr>
+          <w:rFonts w:ascii="Times New Roman" w:hAnsi="Times New Roman" w:eastAsia="Times New Roman"/>
+          <w:b w:val="0"/>
+          <w:i w:val="0"/>
+          <w:color w:val="171717"/>
+          <w:sz w:val="22"/>
+        </w:rPr>
+        <w:t>Qwen3-32B receives only canonical public news text, required evidence IDs, underlying, and timestamp. Temperature is zero, extended thinking is disabled, and output must contain exactly one assessment per ID: direction score, volatility score, and short rationale. Unknown keys, missing or duplicate IDs, nonfinite scores, malformed JSON, timeout, identity mismatch, or hash mismatch fails extraction [17].</w:t>
+      </w:r>
+    </w:p>
+    <w:p>
+      <w:pPr>
+        <w:keepLines/>
+        <w:widowControl/>
+        <w:spacing w:line="276" w:lineRule="auto" w:after="120"/>
+        <w:ind w:firstLine="346"/>
+        <w:jc w:val="both"/>
+      </w:pPr>
+      <w:r>
+        <w:rPr>
+          <w:rFonts w:ascii="Times New Roman" w:hAnsi="Times New Roman" w:eastAsia="Times New Roman"/>
+          <w:b w:val="0"/>
+          <w:i w:val="0"/>
+          <w:color w:val="171717"/>
+          <w:sz w:val="22"/>
+        </w:rPr>
+        <w:t>The model has no account identifier, credential, equity, buying power, position, compiler state, risk object, candidate list, order payload, or mutation tool. Source text is untrusted data, not instructions. Model output is evidence assessment, not a trade.</w:t>
+      </w:r>
+    </w:p>
+    <w:p>
+      <w:pPr>
+        <w:keepNext/>
+        <w:spacing w:before="160" w:after="80"/>
+      </w:pPr>
+      <w:r>
+        <w:rPr>
+          <w:rFonts w:ascii="Times New Roman" w:hAnsi="Times New Roman" w:eastAsia="Times New Roman"/>
+          <w:b/>
+          <w:i/>
+          <w:color w:val="171717"/>
+          <w:sz w:val="22"/>
+        </w:rPr>
+        <w:t>7.3 Signed market authority and reduction-only confirmation</w:t>
+      </w:r>
+    </w:p>
+    <w:p>
+      <w:pPr>
+        <w:keepLines/>
+        <w:widowControl/>
+        <w:spacing w:line="276" w:lineRule="auto" w:after="120"/>
+        <w:ind w:firstLine="0"/>
+        <w:jc w:val="both"/>
+      </w:pPr>
+      <w:r>
+        <w:rPr>
+          <w:rFonts w:ascii="Times New Roman" w:hAnsi="Times New Roman" w:eastAsia="Times New Roman"/>
+          <w:b w:val="0"/>
+          <w:i w:val="0"/>
+          <w:color w:val="171717"/>
+          <w:sz w:val="22"/>
+        </w:rPr>
+        <w:t>For family j,</w:t>
       </w:r>
     </w:p>
     <w:p>
@@ -5344,7 +5570,7 @@
           <w:color w:val="171717"/>
           <w:sz w:val="20"/>
         </w:rPr>
-        <w:t>d = Σ_j a_jd_j / Σ_j a_j.</w:t>
+        <w:t>a_j = b_j × quality_j × freshness_j × calibration_j × independence_j,</w:t>
       </w:r>
     </w:p>
     <w:p>
@@ -5363,26 +5589,7 @@
           <w:color w:val="171717"/>
           <w:sz w:val="22"/>
         </w:rPr>
-        <w:t>Coverage is min(1, Σ a_j); agreement is the share of absolute directional weight aligned with the aggregate sign. Trading requires |d| ≥ 0.18, coverage ≥ 0.35, and agreement ≥ 0.55 [16,18].</w:t>
-      </w:r>
-    </w:p>
-    <w:p>
-      <w:pPr>
-        <w:keepLines/>
-        <w:widowControl/>
-        <w:spacing w:line="276" w:lineRule="auto" w:after="120"/>
-        <w:ind w:firstLine="346"/>
-        <w:jc w:val="both"/>
-      </w:pPr>
-      <w:r>
-        <w:rPr>
-          <w:rFonts w:ascii="Times New Roman" w:hAnsi="Times New Roman" w:eastAsia="Times New Roman"/>
-          <w:b w:val="0"/>
-          <w:i w:val="0"/>
-          <w:color w:val="171717"/>
-          <w:sz w:val="22"/>
-        </w:rPr>
-        <w:t>The live economic-authority path removes events from deterministic direction. Let d_D be deterministic direction and u the bullish economic cap. Negative event evidence creates</w:t>
+        <w:t>where base weights are 0.50 market, 0.20 options, 0.25 events, and 0.05 prediction market. In the generic library path,</w:t>
       </w:r>
     </w:p>
     <w:p>
@@ -5402,7 +5609,7 @@
           <w:color w:val="171717"/>
           <w:sz w:val="20"/>
         </w:rPr>
-        <w:t>g_model = clip[1 − Σ_events,dⱼ&lt;0 {(−d_j)a_j / 0.25}, 0, 1].</w:t>
+        <w:t>d = Σ_j a_jd_j / Σ_j a_j.</w:t>
       </w:r>
     </w:p>
     <w:p>
@@ -5421,7 +5628,26 @@
           <w:color w:val="171717"/>
           <w:sz w:val="22"/>
         </w:rPr>
-        <w:t>The supported score is</w:t>
+        <w:t>Coverage is min(1, Σ a_j); agreement is the share of absolute directional weight aligned with the permitted sign. The generic frozen library path retains thresholds |d| ≥ 0.18, coverage ≥ 0.35, and agreement ≥ 0.55. Live v2 uses |d| ≥ 0.12, coverage ≥ 0.30, and agreement ≥ 0.45 [16,18].</w:t>
+      </w:r>
+    </w:p>
+    <w:p>
+      <w:pPr>
+        <w:keepLines/>
+        <w:widowControl/>
+        <w:spacing w:line="276" w:lineRule="auto" w:after="120"/>
+        <w:ind w:firstLine="346"/>
+        <w:jc w:val="both"/>
+      </w:pPr>
+      <w:r>
+        <w:rPr>
+          <w:rFonts w:ascii="Times New Roman" w:hAnsi="Times New Roman" w:eastAsia="Times New Roman"/>
+          <w:b w:val="0"/>
+          <w:i w:val="0"/>
+          <w:color w:val="171717"/>
+          <w:sz w:val="22"/>
+        </w:rPr>
+        <w:t>In the current live path, market momentum alone owns the sign. Let s = sign(d_market), and let u be the capacity from the frozen risk-on guard. Options and event evidence that oppose s create</w:t>
       </w:r>
     </w:p>
     <w:p>
@@ -5441,7 +5667,7 @@
           <w:color w:val="171717"/>
           <w:sz w:val="20"/>
         </w:rPr>
-        <w:t>d_supported = min[u, max(0,d_D)] × g_model.</w:t>
+        <w:t>g_confirm = clip[1 − Σ_{j∈{options,events}, sign(d_j)=−s} {|d_j|a_j/b_j}, 0, 1].</w:t>
       </w:r>
     </w:p>
     <w:p>
@@ -5460,77 +5686,7 @@
           <w:color w:val="171717"/>
           <w:sz w:val="22"/>
         </w:rPr>
-        <w:t>Positive model evidence cannot increase it. Negative evidence reduces it and may drive it to zero. This monotone, reduction-only relationship is Finly's central controlled-delegation property.</w:t>
-      </w:r>
-    </w:p>
-    <w:p>
-      <w:pPr>
-        <w:keepNext/>
-        <w:spacing w:before="260" w:after="100"/>
-      </w:pPr>
-      <w:r>
-        <w:rPr>
-          <w:rFonts w:ascii="Times New Roman" w:hAnsi="Times New Roman" w:eastAsia="Times New Roman"/>
-          <w:b/>
-          <w:i w:val="0"/>
-          <w:color w:val="171717"/>
-          <w:sz w:val="27"/>
-        </w:rPr>
-        <w:t>8. Deterministic options compilation</w:t>
-      </w:r>
-    </w:p>
-    <w:p>
-      <w:pPr>
-        <w:keepNext/>
-        <w:spacing w:before="160" w:after="80"/>
-      </w:pPr>
-      <w:r>
-        <w:rPr>
-          <w:rFonts w:ascii="Times New Roman" w:hAnsi="Times New Roman" w:eastAsia="Times New Roman"/>
-          <w:b/>
-          <w:i/>
-          <w:color w:val="171717"/>
-          <w:sz w:val="22"/>
-        </w:rPr>
-        <w:t>8.1 Enumeration and payoff</w:t>
-      </w:r>
-    </w:p>
-    <w:p>
-      <w:pPr>
-        <w:keepLines/>
-        <w:widowControl/>
-        <w:spacing w:line="276" w:lineRule="auto" w:after="120"/>
-        <w:ind w:firstLine="0"/>
-        <w:jc w:val="both"/>
-      </w:pPr>
-      <w:r>
-        <w:rPr>
-          <w:rFonts w:ascii="Times New Roman" w:hAnsi="Times New Roman" w:eastAsia="Times New Roman"/>
-          <w:b w:val="0"/>
-          <w:i w:val="0"/>
-          <w:color w:val="171717"/>
-          <w:sz w:val="22"/>
-        </w:rPr>
-        <w:t>The compiler accepts SPY and three library outcomes: bull-call debit spread, bear-put debit spread, or no trade. Quotes must pass schema, underlying, right, feed, age, relative spread, open-interest, tradability, and DTE checks. Entry DTE is three to fourteen days; maximum relative leg spread is 0.25; minimum open interest is 50; indicative quotes may be ninety seconds old and OPRA quotes thirty seconds [18].</w:t>
-      </w:r>
-    </w:p>
-    <w:p>
-      <w:pPr>
-        <w:keepLines/>
-        <w:widowControl/>
-        <w:spacing w:line="276" w:lineRule="auto" w:after="120"/>
-        <w:ind w:firstLine="346"/>
-        <w:jc w:val="both"/>
-      </w:pPr>
-      <w:r>
-        <w:rPr>
-          <w:rFonts w:ascii="Times New Roman" w:hAnsi="Times New Roman" w:eastAsia="Times New Roman"/>
-          <w:b w:val="0"/>
-          <w:i w:val="0"/>
-          <w:color w:val="171717"/>
-          <w:sz w:val="22"/>
-        </w:rPr>
-        <w:t>For each same-expiry pair, code assigns the lower-strike call as bullish long leg or higher-strike put as bearish long leg. Width W is $1–$15. Entry debit is</w:t>
+        <w:t>The supported score is</w:t>
       </w:r>
     </w:p>
     <w:p>
@@ -5550,7 +5706,7 @@
           <w:color w:val="171717"/>
           <w:sz w:val="20"/>
         </w:rPr>
-        <w:t>D = ask_long − bid_short + 2($0.03).</w:t>
+        <w:t>d_supported = s × min[u, |d_market|] × g_confirm.</w:t>
       </w:r>
     </w:p>
     <w:p>
@@ -5569,7 +5725,77 @@
           <w:color w:val="171717"/>
           <w:sz w:val="22"/>
         </w:rPr>
-        <w:t>Candidates require 0 &lt; D &lt; W. For one contract,</w:t>
+        <w:t>Thus a bullish market score can compile only a bull-call spread, a bearish market score can compile only a bear-put spread, and neutral or insufficiently confirmed evidence becomes no trade. Options skew and Qwen-assessed news may improve agreement or reduce the view; neither can reverse the price sign or enlarge its magnitude above the market-and-guard envelope. This signed, reduction-only relationship is Finly's central controlled-delegation property.</w:t>
+      </w:r>
+    </w:p>
+    <w:p>
+      <w:pPr>
+        <w:keepNext/>
+        <w:spacing w:before="260" w:after="100"/>
+      </w:pPr>
+      <w:r>
+        <w:rPr>
+          <w:rFonts w:ascii="Times New Roman" w:hAnsi="Times New Roman" w:eastAsia="Times New Roman"/>
+          <w:b/>
+          <w:i w:val="0"/>
+          <w:color w:val="171717"/>
+          <w:sz w:val="27"/>
+        </w:rPr>
+        <w:t>8. Deterministic options compilation</w:t>
+      </w:r>
+    </w:p>
+    <w:p>
+      <w:pPr>
+        <w:keepNext/>
+        <w:spacing w:before="160" w:after="80"/>
+      </w:pPr>
+      <w:r>
+        <w:rPr>
+          <w:rFonts w:ascii="Times New Roman" w:hAnsi="Times New Roman" w:eastAsia="Times New Roman"/>
+          <w:b/>
+          <w:i/>
+          <w:color w:val="171717"/>
+          <w:sz w:val="22"/>
+        </w:rPr>
+        <w:t>8.1 Enumeration and payoff</w:t>
+      </w:r>
+    </w:p>
+    <w:p>
+      <w:pPr>
+        <w:keepLines/>
+        <w:widowControl/>
+        <w:spacing w:line="276" w:lineRule="auto" w:after="120"/>
+        <w:ind w:firstLine="0"/>
+        <w:jc w:val="both"/>
+      </w:pPr>
+      <w:r>
+        <w:rPr>
+          <w:rFonts w:ascii="Times New Roman" w:hAnsi="Times New Roman" w:eastAsia="Times New Roman"/>
+          <w:b w:val="0"/>
+          <w:i w:val="0"/>
+          <w:color w:val="171717"/>
+          <w:sz w:val="22"/>
+        </w:rPr>
+        <w:t>The compiler accepts SPY and three library outcomes: bull-call debit spread, bear-put debit spread, or no trade. Quotes must pass schema, underlying, right, feed, age, relative spread, open-interest, tradability, and DTE checks. Entry DTE is three to fourteen days; maximum relative leg spread is 0.25; minimum open interest is 50; indicative quotes may be ninety seconds old and OPRA quotes thirty seconds [18].</w:t>
+      </w:r>
+    </w:p>
+    <w:p>
+      <w:pPr>
+        <w:keepLines/>
+        <w:widowControl/>
+        <w:spacing w:line="276" w:lineRule="auto" w:after="120"/>
+        <w:ind w:firstLine="346"/>
+        <w:jc w:val="both"/>
+      </w:pPr>
+      <w:r>
+        <w:rPr>
+          <w:rFonts w:ascii="Times New Roman" w:hAnsi="Times New Roman" w:eastAsia="Times New Roman"/>
+          <w:b w:val="0"/>
+          <w:i w:val="0"/>
+          <w:color w:val="171717"/>
+          <w:sz w:val="22"/>
+        </w:rPr>
+        <w:t>For each same-expiry pair, code assigns the lower-strike call as bullish long leg or higher-strike put as bearish long leg. Width W is $1–$15. Entry debit is</w:t>
       </w:r>
     </w:p>
     <w:p>
@@ -5589,7 +5815,7 @@
           <w:color w:val="171717"/>
           <w:sz w:val="20"/>
         </w:rPr>
-        <w:t>Maximum loss = 100D; Maximum gain = 100(W − D).</w:t>
+        <w:t>D = ask_long − bid_short + 2($0.03).</w:t>
       </w:r>
     </w:p>
     <w:p>
@@ -5608,7 +5834,7 @@
           <w:color w:val="171717"/>
           <w:sz w:val="22"/>
         </w:rPr>
-        <w:t>with reward-to-risk at least 1.25. Terminal payoff is</w:t>
+        <w:t>Candidates require 0 &lt; D &lt; W. For one contract,</w:t>
       </w:r>
     </w:p>
     <w:p>
@@ -5628,23 +5854,7 @@
           <w:color w:val="171717"/>
           <w:sz w:val="20"/>
         </w:rPr>
-        <w:t>Π_call(S_T) = 100{min[W, max(0, S_T − K_long)] − D}; Π_put(S_T) = 100{min[W, max(0, K_long − S_T)] − D}.</w:t>
-      </w:r>
-    </w:p>
-    <w:p>
-      <w:pPr>
-        <w:keepNext/>
-        <w:spacing w:before="160" w:after="80"/>
-      </w:pPr>
-      <w:r>
-        <w:rPr>
-          <w:rFonts w:ascii="Times New Roman" w:hAnsi="Times New Roman" w:eastAsia="Times New Roman"/>
-          <w:b/>
-          <w:i/>
-          <w:color w:val="171717"/>
-          <w:sz w:val="22"/>
-        </w:rPr>
-        <w:t>8.2 Scenario valuation</w:t>
+        <w:t>Maximum loss = 100D; Maximum gain = 100(W − D).</w:t>
       </w:r>
     </w:p>
     <w:p>
@@ -5652,7 +5862,7 @@
         <w:keepLines/>
         <w:widowControl/>
         <w:spacing w:line="276" w:lineRule="auto" w:after="120"/>
-        <w:ind w:firstLine="0"/>
+        <w:ind w:firstLine="346"/>
         <w:jc w:val="both"/>
       </w:pPr>
       <w:r>
@@ -5663,7 +5873,7 @@
           <w:color w:val="171717"/>
           <w:sz w:val="22"/>
         </w:rPr>
-        <w:t>Every spread is evaluated under two models with 2,048 paths [19,20]. The tilted-implied model uses normal quantiles. For horizon h, direction d, volatility score v, and mean leg IV:</w:t>
+        <w:t>with live-policy reward-to-risk at least 1.25. Terminal payoff is</w:t>
       </w:r>
     </w:p>
     <w:p>
@@ -5683,7 +5893,23 @@
           <w:color w:val="171717"/>
           <w:sz w:val="20"/>
         </w:rPr>
-        <w:t>σ_A = max[0.08, IV(1 + 0.12v)]; ln[S_h/S₀] = (0.38d − σ_A²/2)(h/252) + σ_A√(h/252)z.</w:t>
+        <w:t>Π_call(S_T) = 100{min[W, max(0, S_T − K_long)] − D}; Π_put(S_T) = 100{min[W, max(0, K_long − S_T)] − D}.</w:t>
+      </w:r>
+    </w:p>
+    <w:p>
+      <w:pPr>
+        <w:keepNext/>
+        <w:spacing w:before="160" w:after="80"/>
+      </w:pPr>
+      <w:r>
+        <w:rPr>
+          <w:rFonts w:ascii="Times New Roman" w:hAnsi="Times New Roman" w:eastAsia="Times New Roman"/>
+          <w:b/>
+          <w:i/>
+          <w:color w:val="171717"/>
+          <w:sz w:val="22"/>
+        </w:rPr>
+        <w:t>8.2 Scenario valuation</w:t>
       </w:r>
     </w:p>
     <w:p>
@@ -5691,7 +5917,7 @@
         <w:keepLines/>
         <w:widowControl/>
         <w:spacing w:line="276" w:lineRule="auto" w:after="120"/>
-        <w:ind w:firstLine="346"/>
+        <w:ind w:firstLine="0"/>
         <w:jc w:val="both"/>
       </w:pPr>
       <w:r>
@@ -5702,7 +5928,7 @@
           <w:color w:val="171717"/>
           <w:sz w:val="22"/>
         </w:rPr>
-        <w:t>The second model draws five-session circular blocks from historical SPY log returns. Its target daily volatility is</w:t>
+        <w:t>Every spread is evaluated under two models with 2,048 paths [19,20]. The tilted-implied model uses normal quantiles. For horizon h, direction d, volatility score v, and mean leg IV:</w:t>
       </w:r>
     </w:p>
     <w:p>
@@ -5722,7 +5948,7 @@
           <w:color w:val="171717"/>
           <w:sz w:val="20"/>
         </w:rPr>
-        <w:t>σ_B,daily = [0.55σ_hist + 0.45(IV/√252)](1 + 0.12v).</w:t>
+        <w:t>σ_A = max[0.08, IV(1 + 0.12v)]; ln[S_h/S₀] = (0.38d − σ_A²/2)(h/252) + σ_A√(h/252)z.</w:t>
       </w:r>
     </w:p>
     <w:p>
@@ -5741,26 +5967,7 @@
           <w:color w:val="171717"/>
           <w:sz w:val="22"/>
         </w:rPr>
-        <w:t>Centered historical returns are scaled to that value, restored to their mean, and receive directional tilt 0.00115d per session. Seeds derive deterministically from candidate ID and market time.</w:t>
-      </w:r>
-    </w:p>
-    <w:p>
-      <w:pPr>
-        <w:keepLines/>
-        <w:widowControl/>
-        <w:spacing w:line="276" w:lineRule="auto" w:after="120"/>
-        <w:ind w:firstLine="346"/>
-        <w:jc w:val="both"/>
-      </w:pPr>
-      <w:r>
-        <w:rPr>
-          <w:rFonts w:ascii="Times New Roman" w:hAnsi="Times New Roman" w:eastAsia="Times New Roman"/>
-          <w:b w:val="0"/>
-          <w:i w:val="0"/>
-          <w:color w:val="171717"/>
-          <w:sz w:val="22"/>
-        </w:rPr>
-        <w:t>Remaining option time at the horizon is</w:t>
+        <w:t>The second model draws five-session circular blocks from historical SPY log returns. Its target daily volatility is</w:t>
       </w:r>
     </w:p>
     <w:p>
@@ -5780,7 +5987,7 @@
           <w:color w:val="171717"/>
           <w:sz w:val="20"/>
         </w:rPr>
-        <w:t>T_remaining = max[1/365, DTE/365 − h/252].</w:t>
+        <w:t>σ_B,daily = [0.55σ_hist + 0.45(IV/√252)](1 + 0.12v).</w:t>
       </w:r>
     </w:p>
     <w:p>
@@ -5799,7 +6006,26 @@
           <w:color w:val="171717"/>
           <w:sz w:val="22"/>
         </w:rPr>
-        <w:t>Each leg is marked with Black–Scholes [21]:</w:t>
+        <w:t>Centered historical returns are scaled to that value, restored to their mean, and receive directional tilt 0.00115d per session. Seeds derive deterministically from candidate ID and market time.</w:t>
+      </w:r>
+    </w:p>
+    <w:p>
+      <w:pPr>
+        <w:keepLines/>
+        <w:widowControl/>
+        <w:spacing w:line="276" w:lineRule="auto" w:after="120"/>
+        <w:ind w:firstLine="346"/>
+        <w:jc w:val="both"/>
+      </w:pPr>
+      <w:r>
+        <w:rPr>
+          <w:rFonts w:ascii="Times New Roman" w:hAnsi="Times New Roman" w:eastAsia="Times New Roman"/>
+          <w:b w:val="0"/>
+          <w:i w:val="0"/>
+          <w:color w:val="171717"/>
+          <w:sz w:val="22"/>
+        </w:rPr>
+        <w:t>Remaining option time at the horizon is</w:t>
       </w:r>
     </w:p>
     <w:p>
@@ -5819,7 +6045,7 @@
           <w:color w:val="171717"/>
           <w:sz w:val="20"/>
         </w:rPr>
-        <w:t>d₁ = {ln(S/K) + (r − q + σ²/2)T} / (σ√T); d₂ = d₁ − σ√T; C = Se^(−qT)Φ(d₁) − Ke^(−rT)Φ(d₂); P = Ke^(−rT)Φ(−d₂) − Se^(−qT)Φ(−d₁).</w:t>
+        <w:t>T_remaining = max[1/365, DTE/365 − h/252].</w:t>
       </w:r>
     </w:p>
     <w:p>
@@ -5838,7 +6064,7 @@
           <w:color w:val="171717"/>
           <w:sz w:val="22"/>
         </w:rPr>
-        <w:t>Close value is clipped to [0,W] after two $0.03 exit-slippage charges. For model m, Finly records mean profit μ_m, standard error SE_m, probability of profit, and five-percent expected shortfall. Conservative expected value is</w:t>
+        <w:t>Each leg is marked with Black–Scholes [21]:</w:t>
       </w:r>
     </w:p>
     <w:p>
@@ -5858,7 +6084,7 @@
           <w:color w:val="171717"/>
           <w:sz w:val="20"/>
         </w:rPr>
-        <w:t>CEV = min_m [μ_m − 1.645 SE_m]; require CEV ≥ max[$10, 0.06 × maximum loss] and conservative probability ≥ 0.53.</w:t>
+        <w:t>d₁ = {ln(S/K) + (r − q + σ²/2)T} / (σ√T); d₂ = d₁ − σ√T; C = Se^(−qT)Φ(d₁) − Ke^(−rT)Φ(d₂); P = Ke^(−rT)Φ(−d₂) − Se^(−qT)Φ(−d₁).</w:t>
       </w:r>
     </w:p>
     <w:p>
@@ -5877,42 +6103,7 @@
           <w:color w:val="171717"/>
           <w:sz w:val="22"/>
         </w:rPr>
-        <w:t>Probability and expected shortfall take the worse model. Among candidates with loss no greater than $500, the compiler maximizes CEV divided by maximum loss and breaks exact ties by stable candidate hash.</w:t>
-      </w:r>
-    </w:p>
-    <w:p>
-      <w:pPr>
-        <w:keepNext/>
-        <w:spacing w:before="160" w:after="80"/>
-      </w:pPr>
-      <w:r>
-        <w:rPr>
-          <w:rFonts w:ascii="Times New Roman" w:hAnsi="Times New Roman" w:eastAsia="Times New Roman"/>
-          <w:b/>
-          <w:i/>
-          <w:color w:val="171717"/>
-          <w:sz w:val="22"/>
-        </w:rPr>
-        <w:t>8.3 Size and challenge suite</w:t>
-      </w:r>
-    </w:p>
-    <w:p>
-      <w:pPr>
-        <w:keepLines/>
-        <w:widowControl/>
-        <w:spacing w:line="276" w:lineRule="auto" w:after="120"/>
-        <w:ind w:firstLine="0"/>
-        <w:jc w:val="both"/>
-      </w:pPr>
-      <w:r>
-        <w:rPr>
-          <w:rFonts w:ascii="Times New Roman" w:hAnsi="Times New Roman" w:eastAsia="Times New Roman"/>
-          <w:b w:val="0"/>
-          <w:i w:val="0"/>
-          <w:color w:val="171717"/>
-          <w:sz w:val="22"/>
-        </w:rPr>
-        <w:t>With equity E and per-contract loss L,</w:t>
+        <w:t>Close value is clipped to [0,W] after two $0.03 exit-slippage charges. For model m, Finly records mean profit μ_m, standard error SE_m, probability of profit, and five-percent expected shortfall. Conservative expected value is</w:t>
       </w:r>
     </w:p>
     <w:p>
@@ -5932,7 +6123,7 @@
           <w:color w:val="171717"/>
           <w:sz w:val="20"/>
         </w:rPr>
-        <w:t>Q = min{4, floor[min(fE, $500)/L]},</w:t>
+        <w:t>CEV = min_m [μ_m − 1.645 SE_m]; the live policy requires CEV ≥ max[$5, 0.02 × maximum loss], conservative probability ≥ 0.45, and reward/risk ≥ 1.25.</w:t>
       </w:r>
     </w:p>
     <w:p>
@@ -5951,80 +6142,7 @@
           <w:color w:val="171717"/>
           <w:sz w:val="22"/>
         </w:rPr>
-        <w:t>where f = 0.005 normally and 0.0025 at half-risk. New plus open defined risk may not exceed 0.03E [22].</w:t>
-      </w:r>
-    </w:p>
-    <w:p>
-      <w:pPr>
-        <w:keepLines/>
-        <w:widowControl/>
-        <w:spacing w:line="276" w:lineRule="auto" w:after="120"/>
-        <w:ind w:firstLine="346"/>
-        <w:jc w:val="both"/>
-      </w:pPr>
-      <w:r>
-        <w:rPr>
-          <w:rFonts w:ascii="Times New Roman" w:hAnsi="Times New Roman" w:eastAsia="Times New Roman"/>
-          <w:b w:val="0"/>
-          <w:i w:val="0"/>
-          <w:color w:val="171717"/>
-          <w:sz w:val="22"/>
-        </w:rPr>
-        <w:t>The complete synthetic fixture contains four families, so leave-one-family-out testing creates four variants. Each must retain the same nonneutral direction, pass coverage and agreement, compile the same action, and leave the fixed candidate above EV and probability gates.</w:t>
-      </w:r>
-    </w:p>
-    <w:p>
-      <w:pPr>
-        <w:keepLines/>
-        <w:widowControl/>
-        <w:spacing w:line="276" w:lineRule="auto" w:after="120"/>
-        <w:ind w:firstLine="346"/>
-        <w:jc w:val="both"/>
-      </w:pPr>
-      <w:r>
-        <w:rPr>
-          <w:rFonts w:ascii="Times New Roman" w:hAnsi="Times New Roman" w:eastAsia="Times New Roman"/>
-          <w:b w:val="0"/>
-          <w:i w:val="0"/>
-          <w:color w:val="171717"/>
-          <w:sz w:val="22"/>
-        </w:rPr>
-        <w:t>Thirty-two deterministic Halton variants perturb source direction by ±0.05, quality by ±0.03, freshness and calibration by ±0.02, independence by ±0.015, spot by ±0.2 percent, leg IV by ±4 percent, history scale from 0.94 to 1.06, interest rate by ±0.5 percentage points, horizon by −1/0/+1, and entry debit by less than $0.04 [23]. Passing requires zero direction flips, at least 90 percent nonneutral direction, 80 percent trade rate, 75 percent same structure, and positive nearest-rank fifth-percentile CEV.</w:t>
-      </w:r>
-    </w:p>
-    <w:p>
-      <w:pPr>
-        <w:keepLines/>
-        <w:widowControl/>
-        <w:spacing w:line="276" w:lineRule="auto" w:after="120"/>
-        <w:ind w:firstLine="346"/>
-        <w:jc w:val="both"/>
-      </w:pPr>
-      <w:r>
-        <w:rPr>
-          <w:rFonts w:ascii="Times New Roman" w:hAnsi="Times New Roman" w:eastAsia="Times New Roman"/>
-          <w:b w:val="0"/>
-          <w:i w:val="0"/>
-          <w:color w:val="171717"/>
-          <w:sz w:val="22"/>
-        </w:rPr>
-        <w:t>In the published synthetic run, four of four removals passed; all thirty-two variants retained direction and trade; trade and same-structure rates were 100 percent; and fifth-percentile CEV was $71.48. The selected bearish fixture had $3.66 debit, $366 maximum loss, $634 maximum gain, CEV $97.18, and 60.89 percent conservative probability [24]. It is a synthetic compiler test. Its synthetic_replay certificate cannot authorize the paper executor.</w:t>
-      </w:r>
-    </w:p>
-    <w:p>
-      <w:pPr>
-        <w:keepNext/>
-        <w:spacing w:before="260" w:after="100"/>
-      </w:pPr>
-      <w:r>
-        <w:rPr>
-          <w:rFonts w:ascii="Times New Roman" w:hAnsi="Times New Roman" w:eastAsia="Times New Roman"/>
-          <w:b/>
-          <w:i w:val="0"/>
-          <w:color w:val="171717"/>
-          <w:sz w:val="27"/>
-        </w:rPr>
-        <w:t>9. Certificate and paper execution</w:t>
+        <w:t>Probability and expected shortfall take the worse model. Among candidates with loss no greater than $500, the compiler maximizes CEV divided by maximum loss and breaks exact ties by stable candidate hash.</w:t>
       </w:r>
     </w:p>
     <w:p>
@@ -6040,7 +6158,7 @@
           <w:color w:val="171717"/>
           <w:sz w:val="22"/>
         </w:rPr>
-        <w:t>9.1 One permit for one order</w:t>
+        <w:t>8.3 Size and challenge suite</w:t>
       </w:r>
     </w:p>
     <w:p>
@@ -6059,26 +6177,7 @@
           <w:color w:val="171717"/>
           <w:sz w:val="22"/>
         </w:rPr>
-        <w:t>A paper-submit certificate is valid for thirty seconds. It contains run and expiry times, paper mode, scope, intent hash, candidate ID and snapshot hash, desired order-projection hash, policy hash, evidence root, account and market hashes, observed spot and time, feed, quantity, loss reservation, entry ceiling, account equity, open risk, CEV, probability, expected shortfall, challenge summaries, and all Boolean checks [22].</w:t>
-      </w:r>
-    </w:p>
-    <w:p>
-      <w:pPr>
-        <w:keepLines/>
-        <w:widowControl/>
-        <w:spacing w:line="276" w:lineRule="auto" w:after="120"/>
-        <w:ind w:firstLine="346"/>
-        <w:jc w:val="both"/>
-      </w:pPr>
-      <w:r>
-        <w:rPr>
-          <w:rFonts w:ascii="Times New Roman" w:hAnsi="Times New Roman" w:eastAsia="Times New Roman"/>
-          <w:b w:val="0"/>
-          <w:i w:val="0"/>
-          <w:color w:val="171717"/>
-          <w:sz w:val="22"/>
-        </w:rPr>
-        <w:t>The certificate ID hashes its canonical body. A separate secret of at least thirty-two bytes signs it:</w:t>
+        <w:t>With equity E and per-contract loss L, the live policy permits</w:t>
       </w:r>
     </w:p>
     <w:p>
@@ -6098,7 +6197,7 @@
           <w:color w:val="171717"/>
           <w:sz w:val="20"/>
         </w:rPr>
-        <w:t>signature = HMAC-SHA256(secret, canonical certificate body).</w:t>
+        <w:t>Q = 1 if L ≤ min(0.005E, $500), and Q = 0 otherwise.</w:t>
       </w:r>
     </w:p>
     <w:p>
@@ -6117,7 +6216,233 @@
           <w:color w:val="171717"/>
           <w:sz w:val="22"/>
         </w:rPr>
-        <w:t>Verification recomputes body hash and HMAC with timing-safe equality, checks paper mode and paper_submit scope, and rejects stale permits. Synthetic certificates use a separate scope. Final preflight may be fifteen seconds old at most; reviewed debit may drift $0.10, SPY 0.5 percent; the account needs Level 3 options and at least 25 percent post-trade buying power.</w:t>
+        <w:t>There is no live half-risk or multi-contract branch. New plus open defined risk may not exceed 0.03E [22]. Thus every live entry is one contract, fits a 0.5-percent equity budget, and has no more than $500 of certified maximum loss.</w:t>
+      </w:r>
+    </w:p>
+    <w:p>
+      <w:pPr>
+        <w:keepLines/>
+        <w:widowControl/>
+        <w:spacing w:line="276" w:lineRule="auto" w:after="120"/>
+        <w:ind w:firstLine="346"/>
+        <w:jc w:val="both"/>
+      </w:pPr>
+      <w:r>
+        <w:rPr>
+          <w:rFonts w:ascii="Times New Roman" w:hAnsi="Times New Roman" w:eastAsia="Times New Roman"/>
+          <w:b w:val="0"/>
+          <w:i w:val="0"/>
+          <w:color w:val="171717"/>
+          <w:sz w:val="22"/>
+        </w:rPr>
+        <w:t>The complete synthetic fixture contains four families, so leave-one-family-out testing creates four variants. In the current live policy these variants are alpha diagnostics: every nonneutral variant must retain the base sign, and an opposite-sign flip is prohibited. Neutralization is recorded as lost confidence rather than a hard-safety failure.</w:t>
+      </w:r>
+    </w:p>
+    <w:p>
+      <w:pPr>
+        <w:keepLines/>
+        <w:widowControl/>
+        <w:spacing w:line="276" w:lineRule="auto" w:after="120"/>
+        <w:ind w:firstLine="346"/>
+        <w:jc w:val="both"/>
+      </w:pPr>
+      <w:r>
+        <w:rPr>
+          <w:rFonts w:ascii="Times New Roman" w:hAnsi="Times New Roman" w:eastAsia="Times New Roman"/>
+          <w:b w:val="0"/>
+          <w:i w:val="0"/>
+          <w:color w:val="171717"/>
+          <w:sz w:val="22"/>
+        </w:rPr>
+        <w:t>Thirty-two deterministic Halton variants perturb source direction by ±0.05, quality by ±0.03, freshness and calibration by ±0.02, independence by ±0.015, spot by ±0.2 percent, leg IV by ±4 percent, history scale from 0.94 to 1.06, interest rate by ±0.5 percentage points, horizon by −1/0/+1, and entry debit by less than $0.04 [23]. Live diagnostics require zero opposite-sign flips, at least 75 percent nonneutral direction, 50 percent trade rate, 50 percent same structure, and nonnegative nearest-rank fifth-percentile CEV. These statistics describe alpha confidence. They do not authorize broker mutation.</w:t>
+      </w:r>
+    </w:p>
+    <w:p>
+      <w:pPr>
+        <w:keepLines/>
+        <w:widowControl/>
+        <w:spacing w:line="276" w:lineRule="auto" w:after="120"/>
+        <w:ind w:firstLine="346"/>
+        <w:jc w:val="both"/>
+      </w:pPr>
+      <w:r>
+        <w:rPr>
+          <w:rFonts w:ascii="Times New Roman" w:hAnsi="Times New Roman" w:eastAsia="Times New Roman"/>
+          <w:b w:val="0"/>
+          <w:i w:val="0"/>
+          <w:color w:val="171717"/>
+          <w:sz w:val="22"/>
+        </w:rPr>
+        <w:t xml:space="preserve">In the frozen published synthetic run, four of four removals passed; all thirty-two variants retained direction and trade; trade and same-structure rates were 100 percent; and fifth-percentile CEV was $71.48. The selected bearish fixture had $3.66 debit, $366 maximum loss, $634 maximum gain, CEV $97.18, and 60.89 percent conservative probability [24]. It remains a synthetic compiler test under the generic replay policy. Its </w:t>
+      </w:r>
+      <w:r>
+        <w:rPr>
+          <w:rFonts w:ascii="Menlo" w:hAnsi="Menlo" w:eastAsia="Menlo"/>
+          <w:b w:val="0"/>
+          <w:i w:val="0"/>
+          <w:color w:val="171717"/>
+          <w:sz w:val="20"/>
+        </w:rPr>
+        <w:t>synthetic_replay</w:t>
+      </w:r>
+      <w:r>
+        <w:rPr>
+          <w:rFonts w:ascii="Times New Roman" w:hAnsi="Times New Roman" w:eastAsia="Times New Roman"/>
+          <w:b w:val="0"/>
+          <w:i w:val="0"/>
+          <w:color w:val="171717"/>
+          <w:sz w:val="22"/>
+        </w:rPr>
+        <w:t xml:space="preserve"> certificate cannot authorize the paper executor, and its figures are not evidence of a live options fill.</w:t>
+      </w:r>
+    </w:p>
+    <w:p>
+      <w:pPr>
+        <w:keepNext/>
+        <w:spacing w:before="260" w:after="100"/>
+      </w:pPr>
+      <w:r>
+        <w:rPr>
+          <w:rFonts w:ascii="Times New Roman" w:hAnsi="Times New Roman" w:eastAsia="Times New Roman"/>
+          <w:b/>
+          <w:i w:val="0"/>
+          <w:color w:val="171717"/>
+          <w:sz w:val="27"/>
+        </w:rPr>
+        <w:t>9. Certificate and paper execution</w:t>
+      </w:r>
+    </w:p>
+    <w:p>
+      <w:pPr>
+        <w:keepNext/>
+        <w:spacing w:before="160" w:after="80"/>
+      </w:pPr>
+      <w:r>
+        <w:rPr>
+          <w:rFonts w:ascii="Times New Roman" w:hAnsi="Times New Roman" w:eastAsia="Times New Roman"/>
+          <w:b/>
+          <w:i/>
+          <w:color w:val="171717"/>
+          <w:sz w:val="22"/>
+        </w:rPr>
+        <w:t>9.1 One permit for one order</w:t>
+      </w:r>
+    </w:p>
+    <w:p>
+      <w:pPr>
+        <w:keepLines/>
+        <w:widowControl/>
+        <w:spacing w:line="276" w:lineRule="auto" w:after="120"/>
+        <w:ind w:firstLine="0"/>
+        <w:jc w:val="both"/>
+      </w:pPr>
+      <w:r>
+        <w:rPr>
+          <w:rFonts w:ascii="Times New Roman" w:hAnsi="Times New Roman" w:eastAsia="Times New Roman"/>
+          <w:b w:val="0"/>
+          <w:i w:val="0"/>
+          <w:color w:val="171717"/>
+          <w:sz w:val="22"/>
+        </w:rPr>
+        <w:t xml:space="preserve">A paper-submit </w:t>
+      </w:r>
+      <w:r>
+        <w:rPr>
+          <w:rFonts w:ascii="Menlo" w:hAnsi="Menlo" w:eastAsia="Menlo"/>
+          <w:b w:val="0"/>
+          <w:i w:val="0"/>
+          <w:color w:val="171717"/>
+          <w:sz w:val="20"/>
+        </w:rPr>
+        <w:t>risk_certificate.v3</w:t>
+      </w:r>
+      <w:r>
+        <w:rPr>
+          <w:rFonts w:ascii="Times New Roman" w:hAnsi="Times New Roman" w:eastAsia="Times New Roman"/>
+          <w:b w:val="0"/>
+          <w:i w:val="0"/>
+          <w:color w:val="171717"/>
+          <w:sz w:val="22"/>
+        </w:rPr>
+        <w:t xml:space="preserve"> is valid for thirty seconds. It contains run and expiry times, paper mode, scope, intent hash, candidate ID and snapshot hash, desired order-projection hash, policy hash, evidence root, account and market hashes, observed spot and time, feed, quantity, loss reservation, entry ceiling, account equity, open risk, CEV, probability, expected shortfall, diagnostic summaries, and all Boolean checks [22]. The hard certificate checks require an eligible candidate, exactly one contract, maximum loss within $500 and the 0.5-percent budget, aggregate risk within three percent of equity, a fresh recognized quote feed, a fresh unblocked paper account, and MCP execution transport. Source-removal and perturbation results are recorded as alpha diagnostics rather than hard authorization checks.</w:t>
+      </w:r>
+    </w:p>
+    <w:p>
+      <w:pPr>
+        <w:keepLines/>
+        <w:widowControl/>
+        <w:spacing w:line="276" w:lineRule="auto" w:after="120"/>
+        <w:ind w:firstLine="346"/>
+        <w:jc w:val="both"/>
+      </w:pPr>
+      <w:r>
+        <w:rPr>
+          <w:rFonts w:ascii="Times New Roman" w:hAnsi="Times New Roman" w:eastAsia="Times New Roman"/>
+          <w:b w:val="0"/>
+          <w:i w:val="0"/>
+          <w:color w:val="171717"/>
+          <w:sz w:val="22"/>
+        </w:rPr>
+        <w:t>The certificate ID hashes its canonical body. A separate secret of at least thirty-two bytes signs it:</w:t>
+      </w:r>
+    </w:p>
+    <w:p>
+      <w:pPr>
+        <w:keepLines/>
+        <w:widowControl/>
+        <w:spacing w:before="80" w:after="140"/>
+        <w:ind w:left="346" w:right="346" w:firstLine="0"/>
+        <w:jc w:val="center"/>
+        <w:shd w:fill="F7F8F6"/>
+      </w:pPr>
+      <w:r>
+        <w:rPr>
+          <w:rFonts w:ascii="Cambria Math" w:hAnsi="Cambria Math" w:eastAsia="Cambria Math"/>
+          <w:b w:val="0"/>
+          <w:i w:val="0"/>
+          <w:color w:val="171717"/>
+          <w:sz w:val="20"/>
+        </w:rPr>
+        <w:t>signature = HMAC-SHA256(secret, canonical certificate body).</w:t>
+      </w:r>
+    </w:p>
+    <w:p>
+      <w:pPr>
+        <w:keepLines/>
+        <w:widowControl/>
+        <w:spacing w:line="276" w:lineRule="auto" w:after="120"/>
+        <w:ind w:firstLine="346"/>
+        <w:jc w:val="both"/>
+      </w:pPr>
+      <w:r>
+        <w:rPr>
+          <w:rFonts w:ascii="Times New Roman" w:hAnsi="Times New Roman" w:eastAsia="Times New Roman"/>
+          <w:b w:val="0"/>
+          <w:i w:val="0"/>
+          <w:color w:val="171717"/>
+          <w:sz w:val="22"/>
+        </w:rPr>
+        <w:t xml:space="preserve">Verification recomputes body hash and HMAC with timing-safe equality, checks paper mode and </w:t>
+      </w:r>
+      <w:r>
+        <w:rPr>
+          <w:rFonts w:ascii="Menlo" w:hAnsi="Menlo" w:eastAsia="Menlo"/>
+          <w:b w:val="0"/>
+          <w:i w:val="0"/>
+          <w:color w:val="171717"/>
+          <w:sz w:val="20"/>
+        </w:rPr>
+        <w:t>paper_submit</w:t>
+      </w:r>
+      <w:r>
+        <w:rPr>
+          <w:rFonts w:ascii="Times New Roman" w:hAnsi="Times New Roman" w:eastAsia="Times New Roman"/>
+          <w:b w:val="0"/>
+          <w:i w:val="0"/>
+          <w:color w:val="171717"/>
+          <w:sz w:val="22"/>
+        </w:rPr>
+        <w:t xml:space="preserve"> scope, and rejects stale permits. Synthetic certificates use a separate scope. Final preflight may be fifteen seconds old at most; reviewed debit may drift $0.10 and SPY 0.5 percent; the account needs Level 3 options and at least 25 percent post-trade buying power. Preflight, idempotent client-order identity, pre-mutation state persistence, and broker reconciliation remain mandatory after certificate issuance.</w:t>
       </w:r>
     </w:p>
     <w:p>
@@ -6585,6 +6910,25 @@
     </w:p>
     <w:p>
       <w:pPr>
+        <w:keepLines/>
+        <w:widowControl/>
+        <w:spacing w:line="276" w:lineRule="auto" w:after="120"/>
+        <w:ind w:firstLine="346"/>
+        <w:jc w:val="both"/>
+      </w:pPr>
+      <w:r>
+        <w:rPr>
+          <w:rFonts w:ascii="Times New Roman" w:hAnsi="Times New Roman" w:eastAsia="Times New Roman"/>
+          <w:b w:val="0"/>
+          <w:i w:val="0"/>
+          <w:color w:val="171717"/>
+          <w:sz w:val="22"/>
+        </w:rPr>
+        <w:t>The options lifecycle is separate. At the force-flat deadline, Finly reconciles the exact working close, cancels only that order, waits for terminal cancellation, and permits at most one deterministic replacement at a $0.01 credit floor. Lost cancellation acknowledgements and restarts recover by exact client-order identifier. Finly never expands the close into a debit or market order; the floor bounds behavior but cannot guarantee a fill.</w:t>
+      </w:r>
+    </w:p>
+    <w:p>
+      <w:pPr>
         <w:keepNext/>
         <w:spacing w:before="160" w:after="80"/>
       </w:pPr>
@@ -6659,17 +7003,17 @@
     <w:p>
       <w:pPr>
         <w:keepNext/>
-        <w:spacing w:before="260" w:after="100"/>
+        <w:spacing w:before="160" w:after="80"/>
       </w:pPr>
       <w:r>
         <w:rPr>
           <w:rFonts w:ascii="Times New Roman" w:hAnsi="Times New Roman" w:eastAsia="Times New Roman"/>
           <w:b/>
-          <w:i w:val="0"/>
+          <w:i/>
           <w:color w:val="171717"/>
-          <w:sz w:val="27"/>
-        </w:rPr>
-        <w:t>10. Verification, reproducibility, and hackathon fit</w:t>
+          <w:sz w:val="22"/>
+        </w:rPr>
+        <w:t>9.4 Current eligibility calibration</w:t>
       </w:r>
     </w:p>
     <w:p>
@@ -6688,7 +7032,61 @@
           <w:color w:val="171717"/>
           <w:sz w:val="22"/>
         </w:rPr>
-        <w:t>The public run executed 809 tests: 807 passed, none failed, and two were skipped [29]. Coverage includes schemas, evidence separation, G4 weights, causal lag, costs, option payoff, Black–Scholes, scenario determinism, removals, perturbations, risk limits, HMAC scopes, broker translation, stale preflight, duplicate recovery, encryption, calendar boundaries, forward attribution, and artifact checks. This establishes tested software behavior, not forecast accuracy or profitability.</w:t>
+        <w:t>The separately versioned live options policy has a deterministic reachability check [37]. It samples 517 five-session SPY signal windows from 20 May 2016 through 26 August 2026, each using 96 completed daily returns, and compiles them against one fixed, symmetric 14-DTE, 20-percent-IV modeled quote surface at a common spot. Eleven of 517 windows (2.12766 percent) clear every gate: seven bullish call spreads and four bearish put spreads. Their maximum losses are $440–$455, conservative EVs are $10.08–$22.26 against required margins of $8.80–$9.10, reward/risk ratios are 2.2967–2.4091, and modeled probabilities of profit are 0.4512–0.4771. The artifact binds the 2,679 Alpaca adjusted closes and all policy inputs by hash.</w:t>
+      </w:r>
+    </w:p>
+    <w:p>
+      <w:pPr>
+        <w:keepLines/>
+        <w:widowControl/>
+        <w:spacing w:line="276" w:lineRule="auto" w:after="120"/>
+        <w:ind w:firstLine="346"/>
+        <w:jc w:val="both"/>
+      </w:pPr>
+      <w:r>
+        <w:rPr>
+          <w:rFonts w:ascii="Times New Roman" w:hAnsi="Times New Roman" w:eastAsia="Times New Roman"/>
+          <w:b w:val="0"/>
+          <w:i w:val="0"/>
+          <w:color w:val="171717"/>
+          <w:sz w:val="22"/>
+        </w:rPr>
+        <w:t>This calibration establishes that the path is reachable but selective. It is not an options P&amp;L backtest: the option surfaces are fixed modeled sensitivities, not historical quotes, and no broker order, fill, or return is inferred.</w:t>
+      </w:r>
+    </w:p>
+    <w:p>
+      <w:pPr>
+        <w:keepNext/>
+        <w:spacing w:before="260" w:after="100"/>
+      </w:pPr>
+      <w:r>
+        <w:rPr>
+          <w:rFonts w:ascii="Times New Roman" w:hAnsi="Times New Roman" w:eastAsia="Times New Roman"/>
+          <w:b/>
+          <w:i w:val="0"/>
+          <w:color w:val="171717"/>
+          <w:sz w:val="27"/>
+        </w:rPr>
+        <w:t>10. Verification, reproducibility, and hackathon fit</w:t>
+      </w:r>
+    </w:p>
+    <w:p>
+      <w:pPr>
+        <w:keepLines/>
+        <w:widowControl/>
+        <w:spacing w:line="276" w:lineRule="auto" w:after="120"/>
+        <w:ind w:firstLine="0"/>
+        <w:jc w:val="both"/>
+      </w:pPr>
+      <w:r>
+        <w:rPr>
+          <w:rFonts w:ascii="Times New Roman" w:hAnsi="Times New Roman" w:eastAsia="Times New Roman"/>
+          <w:b w:val="0"/>
+          <w:i w:val="0"/>
+          <w:color w:val="171717"/>
+          <w:sz w:val="22"/>
+        </w:rPr>
+        <w:t>The public run executed 826 tests: 824 passed, none failed, and two were skipped [29]. Coverage includes schemas, evidence separation, G4 weights, causal lag, costs, signed live direction, eligibility-calibration integrity, option payoff, Black–Scholes, scenario determinism, removal and perturbation diagnostics, live one-contract risk limits, v3 HMAC scope, broker translation, stale preflight, bounded cancel/reprice exits, duplicate recovery, encryption, calendar boundaries, forward attribution, and artifact checks. This establishes tested software behavior, not forecast accuracy or profitability.</w:t>
       </w:r>
     </w:p>
     <w:p>
@@ -7432,7 +7830,7 @@
           <w:color w:val="171717"/>
           <w:sz w:val="22"/>
         </w:rPr>
-        <w:t>The strongest claim is not that an LLM found a guaranteed trade. It is that the division of authority is executable: the model reads; code computes; the permit binds one exact options plan; Alpaca records the allocation execution; and a public scorer measures the complete account without rewriting the rule.</w:t>
+        <w:t>The strongest claim is not that an LLM found a guaranteed trade. It is that the division of authority is executable and versioned: market momentum chooses a bounded sign; options and model evidence may confirm or reduce it; code computes the exact spread and risk; the v3 permit binds one projection; Alpaca records allocation execution; and a public scorer measures the account without retroactively rewriting earlier results.</w:t>
       </w:r>
     </w:p>
     <w:p>
@@ -7622,7 +8020,7 @@
           <w:color w:val="171717"/>
           <w:sz w:val="22"/>
         </w:rPr>
-        <w:t xml:space="preserve"> Qwen can misunderstand or omit context. Schema validation controls shape, not truth; reduction-only authority only limits the consequence.</w:t>
+        <w:t xml:space="preserve"> Qwen can misunderstand or omit context. Schema validation controls shape, not truth; confirmation-only authority limits the consequence but does not establish forecast accuracy.</w:t>
       </w:r>
     </w:p>
     <w:p>
@@ -7641,7 +8039,7 @@
           <w:color w:val="171717"/>
           <w:sz w:val="22"/>
         </w:rPr>
-        <w:t>Operations.</w:t>
+        <w:t>Post-diagnostic calibration.</w:t>
       </w:r>
       <w:r>
         <w:rPr>
@@ -7651,7 +8049,7 @@
           <w:color w:val="171717"/>
           <w:sz w:val="22"/>
         </w:rPr>
-        <w:t xml:space="preserve"> GitHub Actions can fail or run late. State, timing, read, or reconciliation failures become no trade or frozen state.</w:t>
+        <w:t xml:space="preserve"> Live v2 was calibrated after the original configuration repeatedly abstained. Its direction and confidence thresholds therefore have little independent forward exposure. The revision is disclosed and versioned, but it is not evidence of proven options alpha.</w:t>
       </w:r>
     </w:p>
     <w:p>
@@ -7670,6 +8068,35 @@
           <w:color w:val="171717"/>
           <w:sz w:val="22"/>
         </w:rPr>
+        <w:t>Operations.</w:t>
+      </w:r>
+      <w:r>
+        <w:rPr>
+          <w:rFonts w:ascii="Times New Roman" w:hAnsi="Times New Roman" w:eastAsia="Times New Roman"/>
+          <w:b w:val="0"/>
+          <w:i w:val="0"/>
+          <w:color w:val="171717"/>
+          <w:sz w:val="22"/>
+        </w:rPr>
+        <w:t xml:space="preserve"> GitHub Actions can fail or run late. State, timing, read, or reconciliation failures become no trade or frozen state.</w:t>
+      </w:r>
+    </w:p>
+    <w:p>
+      <w:pPr>
+        <w:keepLines/>
+        <w:widowControl/>
+        <w:spacing w:line="276" w:lineRule="auto" w:after="120"/>
+        <w:ind w:firstLine="346"/>
+        <w:jc w:val="both"/>
+      </w:pPr>
+      <w:r>
+        <w:rPr>
+          <w:rFonts w:ascii="Times New Roman" w:hAnsi="Times New Roman" w:eastAsia="Times New Roman"/>
+          <w:b/>
+          <w:i w:val="0"/>
+          <w:color w:val="171717"/>
+          <w:sz w:val="22"/>
+        </w:rPr>
         <w:t>Short forward window.</w:t>
       </w:r>
       <w:r>
@@ -7734,7 +8161,7 @@
           <w:color w:val="171717"/>
           <w:sz w:val="22"/>
         </w:rPr>
-        <w:t>The system turns that tension into design. A distinct SPY/BIL rule bounds the coordinated options sleeve's direction. News may reduce or veto but cannot amplify it. Code owns payoff, EV gates, quantity, loss, and broker fields. A short-lived HMAC certificate binds one state to one projection. Encrypted checkpoints and deterministic IDs make uncertain acknowledgements recoverable. The paper account then observes what happens without changing the rule.</w:t>
+        <w:t>The system turns that tension into design. The frozen SPY/BIL receipt supplies a freshness and long-horizon risk-on guard without choosing the live sign. Fresh SPY price momentum owns that sign; option skew and news may confirm, reduce, or veto but cannot reverse it. Code owns payoff, EV gates, one-contract quantity, loss, and broker fields. A short-lived v3 HMAC certificate binds one state to one projection, while final preflight, encrypted checkpoints, deterministic IDs, and broker reconciliation make uncertain acknowledgements recoverable. The paper account then observes each versioned rule without retroactively changing earlier results.</w:t>
       </w:r>
     </w:p>
     <w:p>
@@ -7790,7 +8217,7 @@
         </w:rPr>
         <w:t xml:space="preserve">[1] Finly. “Submission Requirements and Release Checklist.” </w:t>
       </w:r>
-      <w:hyperlink r:id="rId12">
+      <w:hyperlink r:id="rId14">
         <w:r>
           <w:rPr>
             <w:rFonts w:ascii="Times New Roman" w:hAnsi="Times New Roman"/>
@@ -7830,7 +8257,7 @@
         </w:rPr>
         <w:t xml:space="preserve">[2] Finly. “Frozen G4 Source Signal.” </w:t>
       </w:r>
-      <w:hyperlink r:id="rId13">
+      <w:hyperlink r:id="rId15">
         <w:r>
           <w:rPr>
             <w:rFonts w:ascii="Times New Roman" w:hAnsi="Times New Roman"/>
@@ -7870,7 +8297,7 @@
         </w:rPr>
         <w:t xml:space="preserve">[3] Finly. “Frozen G4 Competition Protocol.” </w:t>
       </w:r>
-      <w:hyperlink r:id="rId14">
+      <w:hyperlink r:id="rId16">
         <w:r>
           <w:rPr>
             <w:rFonts w:ascii="Times New Roman" w:hAnsi="Times New Roman"/>
@@ -7910,7 +8337,7 @@
         </w:rPr>
         <w:t xml:space="preserve">[4] Finly. “Quantitative Release Gate.” </w:t>
       </w:r>
-      <w:hyperlink r:id="rId15">
+      <w:hyperlink r:id="rId17">
         <w:r>
           <w:rPr>
             <w:rFonts w:ascii="Times New Roman" w:hAnsi="Times New Roman"/>
@@ -7950,7 +8377,7 @@
         </w:rPr>
         <w:t xml:space="preserve">[5] Finly. “Generation 4 Simulation Engine.” </w:t>
       </w:r>
-      <w:hyperlink r:id="rId16">
+      <w:hyperlink r:id="rId18">
         <w:r>
           <w:rPr>
             <w:rFonts w:ascii="Times New Roman" w:hAnsi="Times New Roman"/>
@@ -7990,7 +8417,7 @@
         </w:rPr>
         <w:t xml:space="preserve">[6] Finly. “Generation 4 Robustness Result.” </w:t>
       </w:r>
-      <w:hyperlink r:id="rId17">
+      <w:hyperlink r:id="rId19">
         <w:r>
           <w:rPr>
             <w:rFonts w:ascii="Times New Roman" w:hAnsi="Times New Roman"/>
@@ -8030,7 +8457,7 @@
         </w:rPr>
         <w:t xml:space="preserve">[7] Finly. “G4 Wealth and Drawdown Series.” </w:t>
       </w:r>
-      <w:hyperlink r:id="rId18">
+      <w:hyperlink r:id="rId20">
         <w:r>
           <w:rPr>
             <w:rFonts w:ascii="Times New Roman" w:hAnsi="Times New Roman"/>
@@ -8070,7 +8497,7 @@
         </w:rPr>
         <w:t xml:space="preserve">[8] Finly. “Generation 4 Strategy Definitions.” </w:t>
       </w:r>
-      <w:hyperlink r:id="rId19">
+      <w:hyperlink r:id="rId21">
         <w:r>
           <w:rPr>
             <w:rFonts w:ascii="Times New Roman" w:hAnsi="Times New Roman"/>
@@ -8130,7 +8557,7 @@
         </w:rPr>
         <w:t xml:space="preserve"> 104, no. 2 (2012): 228–250. </w:t>
       </w:r>
-      <w:hyperlink r:id="rId20">
+      <w:hyperlink r:id="rId22">
         <w:r>
           <w:rPr>
             <w:rFonts w:ascii="Times New Roman" w:hAnsi="Times New Roman"/>
@@ -8170,7 +8597,7 @@
         </w:rPr>
         <w:t xml:space="preserve">[10] Finly. “Generation 4 Statistical Methods.” </w:t>
       </w:r>
-      <w:hyperlink r:id="rId21">
+      <w:hyperlink r:id="rId23">
         <w:r>
           <w:rPr>
             <w:rFonts w:ascii="Times New Roman" w:hAnsi="Times New Roman"/>
@@ -8210,7 +8637,7 @@
         </w:rPr>
         <w:t xml:space="preserve">[11] Kenneth R. French. </w:t>
       </w:r>
-      <w:hyperlink r:id="rId22">
+      <w:hyperlink r:id="rId24">
         <w:r>
           <w:rPr>
             <w:rFonts w:ascii="Times New Roman" w:hAnsi="Times New Roman"/>
@@ -8250,7 +8677,7 @@
         </w:rPr>
         <w:t xml:space="preserve">[12] Finly. “External-Era Public Evidence.” </w:t>
       </w:r>
-      <w:hyperlink r:id="rId23">
+      <w:hyperlink r:id="rId25">
         <w:r>
           <w:rPr>
             <w:rFonts w:ascii="Times New Roman" w:hAnsi="Times New Roman"/>
@@ -8288,9 +8715,9 @@
           <w:color w:val="5F6368"/>
           <w:sz w:val="17"/>
         </w:rPr>
-        <w:t xml:space="preserve">[13] Finly. “Economic Research and Current Policy.” </w:t>
-      </w:r>
-      <w:hyperlink r:id="rId24">
+        <w:t xml:space="preserve">[13] Finly. “Frozen Economic Research Policy.” </w:t>
+      </w:r>
+      <w:hyperlink r:id="rId26">
         <w:r>
           <w:rPr>
             <w:rFonts w:ascii="Times New Roman" w:hAnsi="Times New Roman"/>
@@ -8330,7 +8757,7 @@
         </w:rPr>
         <w:t xml:space="preserve">[14] Finly. “Economic Research Evidence.” </w:t>
       </w:r>
-      <w:hyperlink r:id="rId25">
+      <w:hyperlink r:id="rId27">
         <w:r>
           <w:rPr>
             <w:rFonts w:ascii="Times New Roman" w:hAnsi="Times New Roman"/>
@@ -8370,7 +8797,7 @@
         </w:rPr>
         <w:t xml:space="preserve">[15] Finly. “Live Signal Construction.” </w:t>
       </w:r>
-      <w:hyperlink r:id="rId26">
+      <w:hyperlink r:id="rId28">
         <w:r>
           <w:rPr>
             <w:rFonts w:ascii="Times New Roman" w:hAnsi="Times New Roman"/>
@@ -8408,9 +8835,9 @@
           <w:color w:val="5F6368"/>
           <w:sz w:val="17"/>
         </w:rPr>
-        <w:t xml:space="preserve">[16] Finly. “Evidence Aggregation.” </w:t>
-      </w:r>
-      <w:hyperlink r:id="rId27">
+        <w:t xml:space="preserve">[16] Finly. “Signed Evidence Aggregation.” </w:t>
+      </w:r>
+      <w:hyperlink r:id="rId29">
         <w:r>
           <w:rPr>
             <w:rFonts w:ascii="Times New Roman" w:hAnsi="Times New Roman"/>
@@ -8450,7 +8877,7 @@
         </w:rPr>
         <w:t xml:space="preserve">[17] Finly. “Hosted Evidence Extractor.” </w:t>
       </w:r>
-      <w:hyperlink r:id="rId28">
+      <w:hyperlink r:id="rId30">
         <w:r>
           <w:rPr>
             <w:rFonts w:ascii="Times New Roman" w:hAnsi="Times New Roman"/>
@@ -8488,9 +8915,9 @@
           <w:color w:val="5F6368"/>
           <w:sz w:val="17"/>
         </w:rPr>
-        <w:t xml:space="preserve">[18] Finly. “Options and Risk Policy.” </w:t>
-      </w:r>
-      <w:hyperlink r:id="rId29">
+        <w:t xml:space="preserve">[18] Finly. “Options, Live Alpha, and Safety Policy.” </w:t>
+      </w:r>
+      <w:hyperlink r:id="rId31">
         <w:r>
           <w:rPr>
             <w:rFonts w:ascii="Times New Roman" w:hAnsi="Times New Roman"/>
@@ -8530,7 +8957,7 @@
         </w:rPr>
         <w:t xml:space="preserve">[19] Finly. “Deterministic Options Compiler.” </w:t>
       </w:r>
-      <w:hyperlink r:id="rId30">
+      <w:hyperlink r:id="rId32">
         <w:r>
           <w:rPr>
             <w:rFonts w:ascii="Times New Roman" w:hAnsi="Times New Roman"/>
@@ -8570,7 +8997,7 @@
         </w:rPr>
         <w:t xml:space="preserve">[20] Finly. “Scenario and Black–Scholes Functions.” </w:t>
       </w:r>
-      <w:hyperlink r:id="rId31">
+      <w:hyperlink r:id="rId33">
         <w:r>
           <w:rPr>
             <w:rFonts w:ascii="Times New Roman" w:hAnsi="Times New Roman"/>
@@ -8630,7 +9057,7 @@
         </w:rPr>
         <w:t xml:space="preserve"> 81, no. 3 (1973): 637–654. </w:t>
       </w:r>
-      <w:hyperlink r:id="rId32">
+      <w:hyperlink r:id="rId34">
         <w:r>
           <w:rPr>
             <w:rFonts w:ascii="Times New Roman" w:hAnsi="Times New Roman"/>
@@ -8668,9 +9095,9 @@
           <w:color w:val="5F6368"/>
           <w:sz w:val="17"/>
         </w:rPr>
-        <w:t xml:space="preserve">[22] Finly. “Risk Certificate.” </w:t>
-      </w:r>
-      <w:hyperlink r:id="rId33">
+        <w:t xml:space="preserve">[22] Finly. “v3 Risk Certificate.” </w:t>
+      </w:r>
+      <w:hyperlink r:id="rId35">
         <w:r>
           <w:rPr>
             <w:rFonts w:ascii="Times New Roman" w:hAnsi="Times New Roman"/>
@@ -8708,9 +9135,9 @@
           <w:color w:val="5F6368"/>
           <w:sz w:val="17"/>
         </w:rPr>
-        <w:t xml:space="preserve">[23] Finly. “Source-Removal and Perturbation Gate.” </w:t>
-      </w:r>
-      <w:hyperlink r:id="rId34">
+        <w:t xml:space="preserve">[23] Finly. “Source-Removal and Perturbation Diagnostics.” </w:t>
+      </w:r>
+      <w:hyperlink r:id="rId36">
         <w:r>
           <w:rPr>
             <w:rFonts w:ascii="Times New Roman" w:hAnsi="Times New Roman"/>
@@ -8750,7 +9177,7 @@
         </w:rPr>
         <w:t xml:space="preserve">[24] Finly. “Latest Synthetic Options Decision Receipt.” </w:t>
       </w:r>
-      <w:hyperlink r:id="rId35">
+      <w:hyperlink r:id="rId37">
         <w:r>
           <w:rPr>
             <w:rFonts w:ascii="Times New Roman" w:hAnsi="Times New Roman"/>
@@ -8790,7 +9217,7 @@
         </w:rPr>
         <w:t xml:space="preserve">[25] Finly. “Official G4 Equity Runner.” </w:t>
       </w:r>
-      <w:hyperlink r:id="rId36">
+      <w:hyperlink r:id="rId38">
         <w:r>
           <w:rPr>
             <w:rFonts w:ascii="Times New Roman" w:hAnsi="Times New Roman"/>
@@ -8830,7 +9257,7 @@
         </w:rPr>
         <w:t xml:space="preserve">[26] Alpaca. “MCP Server.” </w:t>
       </w:r>
-      <w:hyperlink r:id="rId37">
+      <w:hyperlink r:id="rId39">
         <w:r>
           <w:rPr>
             <w:rFonts w:ascii="Times New Roman" w:hAnsi="Times New Roman"/>
@@ -8870,7 +9297,7 @@
         </w:rPr>
         <w:t xml:space="preserve">[27] Finly. “Cloud Runner and Restart Design.” </w:t>
       </w:r>
-      <w:hyperlink r:id="rId38">
+      <w:hyperlink r:id="rId40">
         <w:r>
           <w:rPr>
             <w:rFonts w:ascii="Times New Roman" w:hAnsi="Times New Roman"/>
@@ -8910,7 +9337,7 @@
         </w:rPr>
         <w:t xml:space="preserve">[28] Finly. “Competition Forward-Profit Contract.” </w:t>
       </w:r>
-      <w:hyperlink r:id="rId39">
+      <w:hyperlink r:id="rId41">
         <w:r>
           <w:rPr>
             <w:rFonts w:ascii="Times New Roman" w:hAnsi="Times New Roman"/>
@@ -8948,9 +9375,9 @@
           <w:color w:val="5F6368"/>
           <w:sz w:val="17"/>
         </w:rPr>
-        <w:t xml:space="preserve">[29] Finly. “Public Automated-Test Run.” </w:t>
-      </w:r>
-      <w:hyperlink r:id="rId40">
+        <w:t xml:space="preserve">[29] Finly. “Public Automated Verification.” </w:t>
+      </w:r>
+      <w:hyperlink r:id="rId42">
         <w:r>
           <w:rPr>
             <w:rFonts w:ascii="Times New Roman" w:hAnsi="Times New Roman"/>
@@ -8958,7 +9385,7 @@
             <w:sz w:val="17"/>
             <w:u w:val="single"/>
           </w:rPr>
-          <w:t>GitHub Actions run 33369848292</w:t>
+          <w:t>GitHub Actions</w:t>
         </w:r>
       </w:hyperlink>
       <w:r>
@@ -8990,7 +9417,7 @@
         </w:rPr>
         <w:t xml:space="preserve">[30] lablab.ai. </w:t>
       </w:r>
-      <w:hyperlink r:id="rId41">
+      <w:hyperlink r:id="rId43">
         <w:r>
           <w:rPr>
             <w:rFonts w:ascii="Times New Roman" w:hAnsi="Times New Roman"/>
@@ -9030,7 +9457,7 @@
         </w:rPr>
         <w:t xml:space="preserve">[31] Finly. </w:t>
       </w:r>
-      <w:hyperlink r:id="rId42">
+      <w:hyperlink r:id="rId44">
         <w:r>
           <w:rPr>
             <w:rFonts w:ascii="Times New Roman" w:hAnsi="Times New Roman"/>
@@ -9070,7 +9497,7 @@
         </w:rPr>
         <w:t xml:space="preserve">[32] Finly. “Sanitized Competition Account Snapshot.” </w:t>
       </w:r>
-      <w:hyperlink r:id="rId43">
+      <w:hyperlink r:id="rId45">
         <w:r>
           <w:rPr>
             <w:rFonts w:ascii="Times New Roman" w:hAnsi="Times New Roman"/>
@@ -9130,7 +9557,7 @@
         </w:rPr>
         <w:t xml:space="preserve"> 68, no. 5 (2000): 1097–1126. </w:t>
       </w:r>
-      <w:hyperlink r:id="rId44">
+      <w:hyperlink r:id="rId46">
         <w:r>
           <w:rPr>
             <w:rFonts w:ascii="Times New Roman" w:hAnsi="Times New Roman"/>
@@ -9190,7 +9617,7 @@
         </w:rPr>
         <w:t xml:space="preserve"> 40, no. 5 (2014): 94–107. </w:t>
       </w:r>
-      <w:hyperlink r:id="rId45">
+      <w:hyperlink r:id="rId47">
         <w:r>
           <w:rPr>
             <w:rFonts w:ascii="Times New Roman" w:hAnsi="Times New Roman"/>
@@ -9230,7 +9657,7 @@
         </w:rPr>
         <w:t xml:space="preserve">[35] Finly. “First-Session Same-Clock Forward Measurement.” </w:t>
       </w:r>
-      <w:hyperlink r:id="rId46">
+      <w:hyperlink r:id="rId48">
         <w:r>
           <w:rPr>
             <w:rFonts w:ascii="Times New Roman" w:hAnsi="Times New Roman"/>
@@ -9239,6 +9666,86 @@
             <w:u w:val="single"/>
           </w:rPr>
           <w:t>public/data/competition_forward_profit_2026_08_31.json</w:t>
+        </w:r>
+      </w:hyperlink>
+      <w:r>
+        <w:rPr>
+          <w:rFonts w:ascii="Times New Roman" w:hAnsi="Times New Roman" w:eastAsia="Times New Roman"/>
+          <w:b w:val="0"/>
+          <w:i w:val="0"/>
+          <w:color w:val="5F6368"/>
+          <w:sz w:val="17"/>
+        </w:rPr>
+        <w:t>.</w:t>
+      </w:r>
+    </w:p>
+    <w:p>
+      <w:pPr>
+        <w:keepLines w:val="0"/>
+        <w:widowControl/>
+        <w:spacing w:line="240" w:lineRule="auto" w:after="42"/>
+        <w:ind w:left="346" w:hanging="346"/>
+        <w:jc w:val="both"/>
+      </w:pPr>
+      <w:r>
+        <w:rPr>
+          <w:rFonts w:ascii="Times New Roman" w:hAnsi="Times New Roman" w:eastAsia="Times New Roman"/>
+          <w:b w:val="0"/>
+          <w:i w:val="0"/>
+          <w:color w:val="5F6368"/>
+          <w:sz w:val="17"/>
+        </w:rPr>
+        <w:t xml:space="preserve">[36] Finly. “Live v2 Economic Options Authority.” </w:t>
+      </w:r>
+      <w:hyperlink r:id="rId49">
+        <w:r>
+          <w:rPr>
+            <w:rFonts w:ascii="Times New Roman" w:hAnsi="Times New Roman"/>
+            <w:color w:val="1F5A4C"/>
+            <w:sz w:val="17"/>
+            <w:u w:val="single"/>
+          </w:rPr>
+          <w:t>lib/live_economic_options_authority.mjs</w:t>
+        </w:r>
+      </w:hyperlink>
+      <w:r>
+        <w:rPr>
+          <w:rFonts w:ascii="Times New Roman" w:hAnsi="Times New Roman" w:eastAsia="Times New Roman"/>
+          <w:b w:val="0"/>
+          <w:i w:val="0"/>
+          <w:color w:val="5F6368"/>
+          <w:sz w:val="17"/>
+        </w:rPr>
+        <w:t>.</w:t>
+      </w:r>
+    </w:p>
+    <w:p>
+      <w:pPr>
+        <w:keepLines w:val="0"/>
+        <w:widowControl/>
+        <w:spacing w:line="240" w:lineRule="auto" w:after="42"/>
+        <w:ind w:left="346" w:hanging="346"/>
+        <w:jc w:val="both"/>
+      </w:pPr>
+      <w:r>
+        <w:rPr>
+          <w:rFonts w:ascii="Times New Roman" w:hAnsi="Times New Roman" w:eastAsia="Times New Roman"/>
+          <w:b w:val="0"/>
+          <w:i w:val="0"/>
+          <w:color w:val="5F6368"/>
+          <w:sz w:val="17"/>
+        </w:rPr>
+        <w:t xml:space="preserve">[37] Finly. “Current Signal and Quote-Surface Eligibility Calibration.” </w:t>
+      </w:r>
+      <w:hyperlink r:id="rId50">
+        <w:r>
+          <w:rPr>
+            <w:rFonts w:ascii="Times New Roman" w:hAnsi="Times New Roman"/>
+            <w:color w:val="1F5A4C"/>
+            <w:sz w:val="17"/>
+            <w:u w:val="single"/>
+          </w:rPr>
+          <w:t>public/data/options_policy_calibration.json</w:t>
         </w:r>
       </w:hyperlink>
       <w:r>

</xml_diff>

<commit_message>
Finalize September 2 judge evidence
</commit_message>
<xml_diff>
--- a/public/judge/Finly_Engineering_Appendix.docx
+++ b/public/judge/Finly_Engineering_Appendix.docx
@@ -66,7 +66,7 @@
           <w:color w:val="5F6368"/>
           <w:sz w:val="16"/>
         </w:rPr>
-        <w:t>31 August 2026</w:t>
+        <w:t>2 September 2026</w:t>
       </w:r>
     </w:p>
     <w:p>
@@ -158,7 +158,27 @@
           <w:color w:val="171717"/>
           <w:sz w:val="20"/>
         </w:rPr>
-        <w:t>This paper specifies the algorithms, causal timing, cost conventions, statistical tests, risk constraints, state transitions, and reproducibility boundary. At the first closing bell, 15 ETF fill events had built the allocation sleeve; Finly was up $95.32 while the same-$100,000 SPY raw-price benchmark was down $57.99, a $153.31 advantage at one exact timestamp. The evidence supports an inspectable paper-trading experiment, not durable alpha, verified live options profit, or future outperformance.</w:t>
+        <w:t xml:space="preserve">This paper specifies the algorithms, causal timing, cost conventions, statistical tests, risk constraints, state transitions, and reproducibility boundary. Through the September 2 closing bell, 15 ETF fill events had built the allocation sleeve; Finly was up $141.24 while the same-$100,000 SPY raw-price benchmark was down $284.76, a $426.00 advantage at one exact timestamp. The options sleeve completed 24 live evaluation cycles that day; all ended </w:t>
+      </w:r>
+      <w:r>
+        <w:rPr>
+          <w:rFonts w:ascii="Menlo" w:hAnsi="Menlo" w:eastAsia="Menlo"/>
+          <w:b w:val="0"/>
+          <w:i w:val="0"/>
+          <w:color w:val="171717"/>
+          <w:sz w:val="19"/>
+        </w:rPr>
+        <w:t>NO_TRADE</w:t>
+      </w:r>
+      <w:r>
+        <w:rPr>
+          <w:rFonts w:ascii="Times New Roman" w:hAnsi="Times New Roman" w:eastAsia="Times New Roman"/>
+          <w:b w:val="0"/>
+          <w:i w:val="0"/>
+          <w:color w:val="171717"/>
+          <w:sz w:val="20"/>
+        </w:rPr>
+        <w:t>, so it opened no option position and added no new options risk. The evidence supports an inspectable paper-trading experiment, not durable alpha, verified live options profit, or future outperformance.</w:t>
       </w:r>
     </w:p>
     <w:p>
@@ -6997,7 +7017,27 @@
           <w:color w:val="171717"/>
           <w:sz w:val="22"/>
         </w:rPr>
-        <w:t>The GET-only scorer compares Finly with same-timestamp SPY and rejects cashflow or provenance breaks [28]. At the first close, Finly was +$95.32 versus SPY -$57.99 at 4:00 p.m. ET: +$153.31 after 15 ETF fill events and zero external cashflows [35].</w:t>
+        <w:t xml:space="preserve">The GET-only scorer compares Finly with same-timestamp SPY and rejects cashflow or provenance breaks [28]. Through the September 2 close, Finly was +$141.24 versus SPY -$284.76 at 4:00 p.m. ET: +$426.00 after 15 ETF fill events and zero external cashflows [35]. The same day's 24 live options evaluations produced 14 certification failures, six insufficient-evidence decisions, and four post-cutoff decisions; all 24 ended </w:t>
+      </w:r>
+      <w:r>
+        <w:rPr>
+          <w:rFonts w:ascii="Menlo" w:hAnsi="Menlo" w:eastAsia="Menlo"/>
+          <w:b w:val="0"/>
+          <w:i w:val="0"/>
+          <w:color w:val="171717"/>
+          <w:sz w:val="20"/>
+        </w:rPr>
+        <w:t>NO_TRADE</w:t>
+      </w:r>
+      <w:r>
+        <w:rPr>
+          <w:rFonts w:ascii="Times New Roman" w:hAnsi="Times New Roman" w:eastAsia="Times New Roman"/>
+          <w:b w:val="0"/>
+          <w:i w:val="0"/>
+          <w:color w:val="171717"/>
+          <w:sz w:val="22"/>
+        </w:rPr>
+        <w:t xml:space="preserve"> with zero option orders and fills [38].</w:t>
       </w:r>
     </w:p>
     <w:p>
@@ -7086,7 +7126,7 @@
           <w:color w:val="171717"/>
           <w:sz w:val="22"/>
         </w:rPr>
-        <w:t>The public run executed 826 tests: 824 passed, none failed, and two were skipped [29]. Coverage includes schemas, evidence separation, G4 weights, causal lag, costs, signed live direction, eligibility-calibration integrity, option payoff, Black–Scholes, scenario determinism, removal and perturbation diagnostics, live one-contract risk limits, v3 HMAC scope, broker translation, stale preflight, bounded cancel/reprice exits, duplicate recovery, encryption, calendar boundaries, forward attribution, and artifact checks. This establishes tested software behavior, not forecast accuracy or profitability.</w:t>
+        <w:t>The public run executed 827 tests: 825 passed, none failed, and two were skipped [29]. Coverage includes schemas, evidence separation, G4 weights, causal lag, costs, signed live direction, eligibility-calibration integrity, option payoff, Black–Scholes, scenario determinism, removal and perturbation diagnostics, live one-contract risk limits, v3 HMAC scope, broker translation, stale preflight, bounded cancel/reprice exits, duplicate recovery, encryption, calendar boundaries, forward attribution, and artifact checks. This establishes tested software behavior, not forecast accuracy or profitability.</w:t>
       </w:r>
     </w:p>
     <w:p>
@@ -9655,7 +9695,7 @@
           <w:color w:val="5F6368"/>
           <w:sz w:val="17"/>
         </w:rPr>
-        <w:t xml:space="preserve">[35] Finly. “First-Session Same-Clock Forward Measurement.” </w:t>
+        <w:t xml:space="preserve">[35] Finly. “September 2 Same-Clock Forward Measurement.” </w:t>
       </w:r>
       <w:hyperlink r:id="rId48">
         <w:r>
@@ -9665,7 +9705,7 @@
             <w:sz w:val="17"/>
             <w:u w:val="single"/>
           </w:rPr>
-          <w:t>public/data/competition_forward_profit_2026_08_31.json</w:t>
+          <w:t>public/data/competition_forward_profit_2026_09_02.json</w:t>
         </w:r>
       </w:hyperlink>
       <w:r>
@@ -9746,6 +9786,46 @@
             <w:u w:val="single"/>
           </w:rPr>
           <w:t>public/data/options_policy_calibration.json</w:t>
+        </w:r>
+      </w:hyperlink>
+      <w:r>
+        <w:rPr>
+          <w:rFonts w:ascii="Times New Roman" w:hAnsi="Times New Roman" w:eastAsia="Times New Roman"/>
+          <w:b w:val="0"/>
+          <w:i w:val="0"/>
+          <w:color w:val="5F6368"/>
+          <w:sz w:val="17"/>
+        </w:rPr>
+        <w:t>.</w:t>
+      </w:r>
+    </w:p>
+    <w:p>
+      <w:pPr>
+        <w:keepLines w:val="0"/>
+        <w:widowControl/>
+        <w:spacing w:line="240" w:lineRule="auto" w:after="42"/>
+        <w:ind w:left="346" w:hanging="346"/>
+        <w:jc w:val="both"/>
+      </w:pPr>
+      <w:r>
+        <w:rPr>
+          <w:rFonts w:ascii="Times New Roman" w:hAnsi="Times New Roman" w:eastAsia="Times New Roman"/>
+          <w:b w:val="0"/>
+          <w:i w:val="0"/>
+          <w:color w:val="5F6368"/>
+          <w:sz w:val="17"/>
+        </w:rPr>
+        <w:t xml:space="preserve">[38] Finly. “September 2 Live Options Decision Record.” </w:t>
+      </w:r>
+      <w:hyperlink r:id="rId51">
+        <w:r>
+          <w:rPr>
+            <w:rFonts w:ascii="Times New Roman" w:hAnsi="Times New Roman"/>
+            <w:color w:val="1F5A4C"/>
+            <w:sz w:val="17"/>
+            <w:u w:val="single"/>
+          </w:rPr>
+          <w:t>public/data/options_live_decision_funnel_2026_09_02.json</w:t>
         </w:r>
       </w:hyperlink>
       <w:r>

</xml_diff>

<commit_message>
Lead submission with historical SPY advantage
</commit_message>
<xml_diff>
--- a/public/judge/Finly_Engineering_Appendix.docx
+++ b/public/judge/Finly_Engineering_Appendix.docx
@@ -101,7 +101,7 @@
           <w:color w:val="171717"/>
           <w:sz w:val="20"/>
         </w:rPr>
-        <w:t>Finly is one autonomous competition strategy built for the Alpaca paper-trading environment. It coordinates a diversified four-fund allocation sleeve with a capped-risk SPY options sleeve while keeping each sleeve's signals, risk account, and broker lifecycle independently auditable. The design begins from a narrow observation: interpreting information and authorizing financial risk are different jobs. A language model may be useful for reading current public news, but it should not silently acquire the authority to choose an instrument, enlarge a position, alter a loss bound, or manufacture a broker order. Finly therefore separates model judgment from capital-bearing decisions and records the boundary in machine-checkable artifacts.</w:t>
+        <w:t>Finly's headline result is a $38,629 historical ending-wealth advantage over SPY. In a cost-modeled simulation from 2 January 2013 through 27 August 2026, the same $10,000 became $106,711 with Finly's four-fund allocation rule and $68,082 with SPY. The comparison is historical rather than live, but it supplied the economic case for turning that rule into one autonomous competition strategy in the Alpaca paper-trading environment. The deployed product coordinates the allocation with a capped-risk SPY options sleeve while keeping each sleeve's signals, risk account, and broker lifecycle independently auditable.</w:t>
       </w:r>
     </w:p>
     <w:p>
@@ -120,7 +120,26 @@
           <w:color w:val="171717"/>
           <w:sz w:val="20"/>
         </w:rPr>
-        <w:t>The four-fund sleeve is internally identified as G4. It assigns one half of its research allocation to QQQ and divides the other half among the three strongest original Select Sector SPDR funds under a twelve-to-six-month relative-momentum rule. The competition deployment scales that allocation to 97 percent, preserves a 3 percent cash reserve, and performs one initial rebalance without in-contest re-optimization. In a consumed, post-selected simulation from 2 January 2013 through 27 August 2026, with modeled one-way costs of five basis points, G4 returned 967.11 percent while SPY returned 580.82 percent. The result is economically large but did not pass Finly's promotion gate: its Deflated Sharpe probability was 3.75 percent, its worst familywise-adjusted bootstrap p-value was 37.18 percent, it did not consistently beat a static SPY/QQQ growth control, and the frozen Yahoo-versus-Alpaca source reconciliation failed closed.</w:t>
+        <w:t>The design begins from a narrow observation: interpreting information and authorizing financial risk are different jobs. A language model may be useful for reading current public news, but it should not silently acquire the authority to choose an instrument, enlarge a position, alter a loss bound, or manufacture a broker order. Finly therefore separates model judgment from capital-bearing decisions and records the boundary in machine-checkable artifacts.</w:t>
+      </w:r>
+    </w:p>
+    <w:p>
+      <w:pPr>
+        <w:keepLines/>
+        <w:widowControl/>
+        <w:spacing w:line="259" w:lineRule="auto" w:after="100"/>
+        <w:ind w:left="259" w:right="259" w:firstLine="0"/>
+        <w:jc w:val="both"/>
+      </w:pPr>
+      <w:r>
+        <w:rPr>
+          <w:rFonts w:ascii="Times New Roman" w:hAnsi="Times New Roman" w:eastAsia="Times New Roman"/>
+          <w:b w:val="0"/>
+          <w:i w:val="0"/>
+          <w:color w:val="171717"/>
+          <w:sz w:val="20"/>
+        </w:rPr>
+        <w:t>The four-fund sleeve is internally identified as G4. It assigns one half of its research allocation to QQQ and divides the other half among the three strongest original Select Sector SPDR funds under a twelve-to-six-month relative-momentum rule. The competition deployment scales that allocation to 97 percent, preserves a 3 percent cash reserve, and performs one initial rebalance without in-contest re-optimization. The 2013–2026 replay returned 967.11 percent while SPY returned 580.82 percent after modeled one-way costs of five basis points. Because that research path was selected after broad testing, Finly presents the economically large result with a separate robustness record rather than relabeling it as forward performance: a fixed simpler version also led in the 1927–2007 industry dataset across all 21 tested rebalance schedules and at five times the modeled trading cost.</w:t>
       </w:r>
     </w:p>
     <w:p>

</xml_diff>